<commit_message>
launchpad : méthode à la version déployée, état et livrables Office à jour
</commit_message>
<xml_diff>
--- a/dist/livrables/C1.2 - WP-03 - Profil de domaine, sources approuvées et recevabilité.docx
+++ b/dist/livrables/C1.2 - WP-03 - Profil de domaine, sources approuvées et recevabilité.docx
@@ -11,7 +11,7 @@
           <w:rFonts w:ascii="Arial" w:cs="Arial" w:eastAsia="Arial" w:hAnsi="Arial"/>
           <w:b/>
           <w:bCs/>
-          <w:color w:val="D98324"/>
+          <w:color w:val="6D3FD1"/>
           <w:spacing w:val="30"/>
           <w:sz w:val="16"/>
           <w:szCs w:val="16"/>
@@ -51,7 +51,7 @@
             <w:tcBorders>
               <w:top w:val="none" w:color="FFFFFF" w:sz="0"/>
               <w:left w:val="none" w:color="FFFFFF" w:sz="0"/>
-              <w:bottom w:val="single" w:color="DCD3C3" w:sz="4"/>
+              <w:bottom w:val="single" w:color="DDD9E5" w:sz="4"/>
               <w:right w:val="none" w:color="FFFFFF" w:sz="0"/>
             </w:tcBorders>
             <w:tcMar>
@@ -79,7 +79,7 @@
             <w:tcBorders>
               <w:top w:val="none" w:color="FFFFFF" w:sz="0"/>
               <w:left w:val="none" w:color="FFFFFF" w:sz="0"/>
-              <w:bottom w:val="single" w:color="DCD3C3" w:sz="4"/>
+              <w:bottom w:val="single" w:color="DDD9E5" w:sz="4"/>
               <w:right w:val="none" w:color="FFFFFF" w:sz="0"/>
             </w:tcBorders>
             <w:tcMar>
@@ -107,7 +107,7 @@
             <w:tcBorders>
               <w:top w:val="none" w:color="FFFFFF" w:sz="0"/>
               <w:left w:val="none" w:color="FFFFFF" w:sz="0"/>
-              <w:bottom w:val="single" w:color="DCD3C3" w:sz="4"/>
+              <w:bottom w:val="single" w:color="DDD9E5" w:sz="4"/>
               <w:right w:val="none" w:color="FFFFFF" w:sz="0"/>
             </w:tcBorders>
             <w:tcMar>
@@ -135,7 +135,7 @@
             <w:tcBorders>
               <w:top w:val="none" w:color="FFFFFF" w:sz="0"/>
               <w:left w:val="none" w:color="FFFFFF" w:sz="0"/>
-              <w:bottom w:val="single" w:color="DCD3C3" w:sz="4"/>
+              <w:bottom w:val="single" w:color="DDD9E5" w:sz="4"/>
               <w:right w:val="none" w:color="FFFFFF" w:sz="0"/>
             </w:tcBorders>
             <w:tcMar>
@@ -163,7 +163,7 @@
             <w:tcBorders>
               <w:top w:val="none" w:color="FFFFFF" w:sz="0"/>
               <w:left w:val="none" w:color="FFFFFF" w:sz="0"/>
-              <w:bottom w:val="single" w:color="DCD3C3" w:sz="4"/>
+              <w:bottom w:val="single" w:color="DDD9E5" w:sz="4"/>
               <w:right w:val="none" w:color="FFFFFF" w:sz="0"/>
             </w:tcBorders>
             <w:tcMar>
@@ -191,7 +191,7 @@
             <w:tcBorders>
               <w:top w:val="none" w:color="FFFFFF" w:sz="0"/>
               <w:left w:val="none" w:color="FFFFFF" w:sz="0"/>
-              <w:bottom w:val="single" w:color="DCD3C3" w:sz="4"/>
+              <w:bottom w:val="single" w:color="DDD9E5" w:sz="4"/>
               <w:right w:val="none" w:color="FFFFFF" w:sz="0"/>
             </w:tcBorders>
             <w:tcMar>
@@ -219,7 +219,7 @@
             <w:tcBorders>
               <w:top w:val="none" w:color="FFFFFF" w:sz="0"/>
               <w:left w:val="none" w:color="FFFFFF" w:sz="0"/>
-              <w:bottom w:val="single" w:color="DCD3C3" w:sz="4"/>
+              <w:bottom w:val="single" w:color="DDD9E5" w:sz="4"/>
               <w:right w:val="none" w:color="FFFFFF" w:sz="0"/>
             </w:tcBorders>
             <w:tcMar>
@@ -247,7 +247,7 @@
             <w:tcBorders>
               <w:top w:val="none" w:color="FFFFFF" w:sz="0"/>
               <w:left w:val="none" w:color="FFFFFF" w:sz="0"/>
-              <w:bottom w:val="single" w:color="DCD3C3" w:sz="4"/>
+              <w:bottom w:val="single" w:color="DDD9E5" w:sz="4"/>
               <w:right w:val="none" w:color="FFFFFF" w:sz="0"/>
             </w:tcBorders>
             <w:tcMar>
@@ -282,7 +282,7 @@
         <w:rPr>
           <w:i/>
           <w:iCs/>
-          <w:color w:val="7C766B"/>
+          <w:color w:val="6C6873"/>
           <w:sz w:val="17"/>
           <w:szCs w:val="17"/>
         </w:rPr>
@@ -303,7 +303,7 @@
           <w:rFonts w:ascii="Arial" w:cs="Arial" w:eastAsia="Arial" w:hAnsi="Arial"/>
           <w:b/>
           <w:bCs/>
-          <w:color w:val="7C766B"/>
+          <w:color w:val="6C6873"/>
           <w:spacing w:val="20"/>
           <w:sz w:val="15"/>
           <w:szCs w:val="15"/>
@@ -541,10 +541,10 @@
             <w:tcBorders>
               <w:top w:val="none" w:color="FFFFFF" w:sz="0"/>
               <w:left w:val="none" w:color="FFFFFF" w:sz="0"/>
-              <w:bottom w:val="single" w:color="DCD3C3" w:sz="4"/>
-              <w:right w:val="none" w:color="FFFFFF" w:sz="0"/>
-            </w:tcBorders>
-            <w:shd w:fill="F1ECE3" w:color="auto" w:val="clear"/>
+              <w:bottom w:val="single" w:color="DDD9E5" w:sz="4"/>
+              <w:right w:val="none" w:color="FFFFFF" w:sz="0"/>
+            </w:tcBorders>
+            <w:shd w:fill="F6F4F9" w:color="auto" w:val="clear"/>
             <w:tcMar>
               <w:top w:type="dxa" w:w="70"/>
               <w:left w:type="dxa" w:w="110"/>
@@ -570,10 +570,10 @@
             <w:tcBorders>
               <w:top w:val="none" w:color="FFFFFF" w:sz="0"/>
               <w:left w:val="none" w:color="FFFFFF" w:sz="0"/>
-              <w:bottom w:val="single" w:color="DCD3C3" w:sz="4"/>
-              <w:right w:val="none" w:color="FFFFFF" w:sz="0"/>
-            </w:tcBorders>
-            <w:shd w:fill="F1ECE3" w:color="auto" w:val="clear"/>
+              <w:bottom w:val="single" w:color="DDD9E5" w:sz="4"/>
+              <w:right w:val="none" w:color="FFFFFF" w:sz="0"/>
+            </w:tcBorders>
+            <w:shd w:fill="F6F4F9" w:color="auto" w:val="clear"/>
             <w:tcMar>
               <w:top w:type="dxa" w:w="70"/>
               <w:left w:type="dxa" w:w="110"/>
@@ -601,7 +601,7 @@
             <w:tcBorders>
               <w:top w:val="none" w:color="FFFFFF" w:sz="0"/>
               <w:left w:val="none" w:color="FFFFFF" w:sz="0"/>
-              <w:bottom w:val="single" w:color="DCD3C3" w:sz="4"/>
+              <w:bottom w:val="single" w:color="DDD9E5" w:sz="4"/>
               <w:right w:val="none" w:color="FFFFFF" w:sz="0"/>
             </w:tcBorders>
             <w:tcMar>
@@ -627,7 +627,7 @@
             <w:tcBorders>
               <w:top w:val="none" w:color="FFFFFF" w:sz="0"/>
               <w:left w:val="none" w:color="FFFFFF" w:sz="0"/>
-              <w:bottom w:val="single" w:color="DCD3C3" w:sz="4"/>
+              <w:bottom w:val="single" w:color="DDD9E5" w:sz="4"/>
               <w:right w:val="none" w:color="FFFFFF" w:sz="0"/>
             </w:tcBorders>
             <w:tcMar>
@@ -671,7 +671,7 @@
             <w:tcBorders>
               <w:top w:val="none" w:color="FFFFFF" w:sz="0"/>
               <w:left w:val="none" w:color="FFFFFF" w:sz="0"/>
-              <w:bottom w:val="single" w:color="DCD3C3" w:sz="4"/>
+              <w:bottom w:val="single" w:color="DDD9E5" w:sz="4"/>
               <w:right w:val="none" w:color="FFFFFF" w:sz="0"/>
             </w:tcBorders>
             <w:tcMar>
@@ -697,7 +697,7 @@
             <w:tcBorders>
               <w:top w:val="none" w:color="FFFFFF" w:sz="0"/>
               <w:left w:val="none" w:color="FFFFFF" w:sz="0"/>
-              <w:bottom w:val="single" w:color="DCD3C3" w:sz="4"/>
+              <w:bottom w:val="single" w:color="DDD9E5" w:sz="4"/>
               <w:right w:val="none" w:color="FFFFFF" w:sz="0"/>
             </w:tcBorders>
             <w:tcMar>
@@ -741,7 +741,7 @@
             <w:tcBorders>
               <w:top w:val="none" w:color="FFFFFF" w:sz="0"/>
               <w:left w:val="none" w:color="FFFFFF" w:sz="0"/>
-              <w:bottom w:val="single" w:color="DCD3C3" w:sz="4"/>
+              <w:bottom w:val="single" w:color="DDD9E5" w:sz="4"/>
               <w:right w:val="none" w:color="FFFFFF" w:sz="0"/>
             </w:tcBorders>
             <w:tcMar>
@@ -767,7 +767,7 @@
             <w:tcBorders>
               <w:top w:val="none" w:color="FFFFFF" w:sz="0"/>
               <w:left w:val="none" w:color="FFFFFF" w:sz="0"/>
-              <w:bottom w:val="single" w:color="DCD3C3" w:sz="4"/>
+              <w:bottom w:val="single" w:color="DDD9E5" w:sz="4"/>
               <w:right w:val="none" w:color="FFFFFF" w:sz="0"/>
             </w:tcBorders>
             <w:tcMar>
@@ -833,7 +833,7 @@
             <w:tcBorders>
               <w:top w:val="none" w:color="FFFFFF" w:sz="0"/>
               <w:left w:val="none" w:color="FFFFFF" w:sz="0"/>
-              <w:bottom w:val="single" w:color="DCD3C3" w:sz="4"/>
+              <w:bottom w:val="single" w:color="DDD9E5" w:sz="4"/>
               <w:right w:val="none" w:color="FFFFFF" w:sz="0"/>
             </w:tcBorders>
             <w:tcMar>
@@ -859,7 +859,7 @@
             <w:tcBorders>
               <w:top w:val="none" w:color="FFFFFF" w:sz="0"/>
               <w:left w:val="none" w:color="FFFFFF" w:sz="0"/>
-              <w:bottom w:val="single" w:color="DCD3C3" w:sz="4"/>
+              <w:bottom w:val="single" w:color="DDD9E5" w:sz="4"/>
               <w:right w:val="none" w:color="FFFFFF" w:sz="0"/>
             </w:tcBorders>
             <w:tcMar>
@@ -903,7 +903,7 @@
             <w:tcBorders>
               <w:top w:val="none" w:color="FFFFFF" w:sz="0"/>
               <w:left w:val="none" w:color="FFFFFF" w:sz="0"/>
-              <w:bottom w:val="single" w:color="DCD3C3" w:sz="4"/>
+              <w:bottom w:val="single" w:color="DDD9E5" w:sz="4"/>
               <w:right w:val="none" w:color="FFFFFF" w:sz="0"/>
             </w:tcBorders>
             <w:tcMar>
@@ -929,7 +929,7 @@
             <w:tcBorders>
               <w:top w:val="none" w:color="FFFFFF" w:sz="0"/>
               <w:left w:val="none" w:color="FFFFFF" w:sz="0"/>
-              <w:bottom w:val="single" w:color="DCD3C3" w:sz="4"/>
+              <w:bottom w:val="single" w:color="DDD9E5" w:sz="4"/>
               <w:right w:val="none" w:color="FFFFFF" w:sz="0"/>
             </w:tcBorders>
             <w:tcMar>
@@ -1020,7 +1020,7 @@
               <w:bottom w:val="none" w:color="FFFFFF" w:sz="0"/>
               <w:right w:val="none" w:color="FFFFFF" w:sz="0"/>
             </w:tcBorders>
-            <w:shd w:fill="FAEDDC" w:color="auto" w:val="clear"/>
+            <w:shd w:fill="EFE7FF" w:color="auto" w:val="clear"/>
             <w:tcMar>
               <w:top w:type="dxa" w:w="70"/>
               <w:left w:type="dxa" w:w="110"/>
@@ -1037,7 +1037,7 @@
                 <w:rFonts w:ascii="Arial" w:cs="Arial" w:eastAsia="Arial" w:hAnsi="Arial"/>
                 <w:b/>
                 <w:bCs/>
-                <w:color w:val="D98324"/>
+                <w:color w:val="6D3FD1"/>
                 <w:spacing w:val="20"/>
                 <w:sz w:val="15"/>
                 <w:szCs w:val="15"/>
@@ -1135,7 +1135,7 @@
           <w:rFonts w:ascii="Arial" w:cs="Arial" w:eastAsia="Arial" w:hAnsi="Arial"/>
           <w:b/>
           <w:bCs/>
-          <w:color w:val="7C766B"/>
+          <w:color w:val="6C6873"/>
           <w:spacing w:val="20"/>
           <w:sz w:val="15"/>
           <w:szCs w:val="15"/>
@@ -1232,10 +1232,10 @@
             <w:tcBorders>
               <w:top w:val="none" w:color="FFFFFF" w:sz="0"/>
               <w:left w:val="none" w:color="FFFFFF" w:sz="0"/>
-              <w:bottom w:val="single" w:color="DCD3C3" w:sz="4"/>
-              <w:right w:val="none" w:color="FFFFFF" w:sz="0"/>
-            </w:tcBorders>
-            <w:shd w:fill="F1ECE3" w:color="auto" w:val="clear"/>
+              <w:bottom w:val="single" w:color="DDD9E5" w:sz="4"/>
+              <w:right w:val="none" w:color="FFFFFF" w:sz="0"/>
+            </w:tcBorders>
+            <w:shd w:fill="F6F4F9" w:color="auto" w:val="clear"/>
             <w:tcMar>
               <w:top w:type="dxa" w:w="70"/>
               <w:left w:type="dxa" w:w="110"/>
@@ -1261,10 +1261,10 @@
             <w:tcBorders>
               <w:top w:val="none" w:color="FFFFFF" w:sz="0"/>
               <w:left w:val="none" w:color="FFFFFF" w:sz="0"/>
-              <w:bottom w:val="single" w:color="DCD3C3" w:sz="4"/>
-              <w:right w:val="none" w:color="FFFFFF" w:sz="0"/>
-            </w:tcBorders>
-            <w:shd w:fill="F1ECE3" w:color="auto" w:val="clear"/>
+              <w:bottom w:val="single" w:color="DDD9E5" w:sz="4"/>
+              <w:right w:val="none" w:color="FFFFFF" w:sz="0"/>
+            </w:tcBorders>
+            <w:shd w:fill="F6F4F9" w:color="auto" w:val="clear"/>
             <w:tcMar>
               <w:top w:type="dxa" w:w="70"/>
               <w:left w:type="dxa" w:w="110"/>
@@ -1290,10 +1290,10 @@
             <w:tcBorders>
               <w:top w:val="none" w:color="FFFFFF" w:sz="0"/>
               <w:left w:val="none" w:color="FFFFFF" w:sz="0"/>
-              <w:bottom w:val="single" w:color="DCD3C3" w:sz="4"/>
-              <w:right w:val="none" w:color="FFFFFF" w:sz="0"/>
-            </w:tcBorders>
-            <w:shd w:fill="F1ECE3" w:color="auto" w:val="clear"/>
+              <w:bottom w:val="single" w:color="DDD9E5" w:sz="4"/>
+              <w:right w:val="none" w:color="FFFFFF" w:sz="0"/>
+            </w:tcBorders>
+            <w:shd w:fill="F6F4F9" w:color="auto" w:val="clear"/>
             <w:tcMar>
               <w:top w:type="dxa" w:w="70"/>
               <w:left w:type="dxa" w:w="110"/>
@@ -1319,10 +1319,10 @@
             <w:tcBorders>
               <w:top w:val="none" w:color="FFFFFF" w:sz="0"/>
               <w:left w:val="none" w:color="FFFFFF" w:sz="0"/>
-              <w:bottom w:val="single" w:color="DCD3C3" w:sz="4"/>
-              <w:right w:val="none" w:color="FFFFFF" w:sz="0"/>
-            </w:tcBorders>
-            <w:shd w:fill="F1ECE3" w:color="auto" w:val="clear"/>
+              <w:bottom w:val="single" w:color="DDD9E5" w:sz="4"/>
+              <w:right w:val="none" w:color="FFFFFF" w:sz="0"/>
+            </w:tcBorders>
+            <w:shd w:fill="F6F4F9" w:color="auto" w:val="clear"/>
             <w:tcMar>
               <w:top w:type="dxa" w:w="70"/>
               <w:left w:type="dxa" w:w="110"/>
@@ -1348,10 +1348,10 @@
             <w:tcBorders>
               <w:top w:val="none" w:color="FFFFFF" w:sz="0"/>
               <w:left w:val="none" w:color="FFFFFF" w:sz="0"/>
-              <w:bottom w:val="single" w:color="DCD3C3" w:sz="4"/>
-              <w:right w:val="none" w:color="FFFFFF" w:sz="0"/>
-            </w:tcBorders>
-            <w:shd w:fill="F1ECE3" w:color="auto" w:val="clear"/>
+              <w:bottom w:val="single" w:color="DDD9E5" w:sz="4"/>
+              <w:right w:val="none" w:color="FFFFFF" w:sz="0"/>
+            </w:tcBorders>
+            <w:shd w:fill="F6F4F9" w:color="auto" w:val="clear"/>
             <w:tcMar>
               <w:top w:type="dxa" w:w="70"/>
               <w:left w:type="dxa" w:w="110"/>
@@ -1377,10 +1377,10 @@
             <w:tcBorders>
               <w:top w:val="none" w:color="FFFFFF" w:sz="0"/>
               <w:left w:val="none" w:color="FFFFFF" w:sz="0"/>
-              <w:bottom w:val="single" w:color="DCD3C3" w:sz="4"/>
-              <w:right w:val="none" w:color="FFFFFF" w:sz="0"/>
-            </w:tcBorders>
-            <w:shd w:fill="F1ECE3" w:color="auto" w:val="clear"/>
+              <w:bottom w:val="single" w:color="DDD9E5" w:sz="4"/>
+              <w:right w:val="none" w:color="FFFFFF" w:sz="0"/>
+            </w:tcBorders>
+            <w:shd w:fill="F6F4F9" w:color="auto" w:val="clear"/>
             <w:tcMar>
               <w:top w:type="dxa" w:w="70"/>
               <w:left w:type="dxa" w:w="110"/>
@@ -1406,10 +1406,10 @@
             <w:tcBorders>
               <w:top w:val="none" w:color="FFFFFF" w:sz="0"/>
               <w:left w:val="none" w:color="FFFFFF" w:sz="0"/>
-              <w:bottom w:val="single" w:color="DCD3C3" w:sz="4"/>
-              <w:right w:val="none" w:color="FFFFFF" w:sz="0"/>
-            </w:tcBorders>
-            <w:shd w:fill="F1ECE3" w:color="auto" w:val="clear"/>
+              <w:bottom w:val="single" w:color="DDD9E5" w:sz="4"/>
+              <w:right w:val="none" w:color="FFFFFF" w:sz="0"/>
+            </w:tcBorders>
+            <w:shd w:fill="F6F4F9" w:color="auto" w:val="clear"/>
             <w:tcMar>
               <w:top w:type="dxa" w:w="70"/>
               <w:left w:type="dxa" w:w="110"/>
@@ -1437,7 +1437,7 @@
             <w:tcBorders>
               <w:top w:val="none" w:color="FFFFFF" w:sz="0"/>
               <w:left w:val="none" w:color="FFFFFF" w:sz="0"/>
-              <w:bottom w:val="single" w:color="DCD3C3" w:sz="4"/>
+              <w:bottom w:val="single" w:color="DDD9E5" w:sz="4"/>
               <w:right w:val="none" w:color="FFFFFF" w:sz="0"/>
             </w:tcBorders>
             <w:tcMar>
@@ -1463,7 +1463,7 @@
             <w:tcBorders>
               <w:top w:val="none" w:color="FFFFFF" w:sz="0"/>
               <w:left w:val="none" w:color="FFFFFF" w:sz="0"/>
-              <w:bottom w:val="single" w:color="DCD3C3" w:sz="4"/>
+              <w:bottom w:val="single" w:color="DDD9E5" w:sz="4"/>
               <w:right w:val="none" w:color="FFFFFF" w:sz="0"/>
             </w:tcBorders>
             <w:tcMar>
@@ -1489,7 +1489,7 @@
             <w:tcBorders>
               <w:top w:val="none" w:color="FFFFFF" w:sz="0"/>
               <w:left w:val="none" w:color="FFFFFF" w:sz="0"/>
-              <w:bottom w:val="single" w:color="DCD3C3" w:sz="4"/>
+              <w:bottom w:val="single" w:color="DDD9E5" w:sz="4"/>
               <w:right w:val="none" w:color="FFFFFF" w:sz="0"/>
             </w:tcBorders>
             <w:tcMar>
@@ -1515,7 +1515,7 @@
             <w:tcBorders>
               <w:top w:val="none" w:color="FFFFFF" w:sz="0"/>
               <w:left w:val="none" w:color="FFFFFF" w:sz="0"/>
-              <w:bottom w:val="single" w:color="DCD3C3" w:sz="4"/>
+              <w:bottom w:val="single" w:color="DDD9E5" w:sz="4"/>
               <w:right w:val="none" w:color="FFFFFF" w:sz="0"/>
             </w:tcBorders>
             <w:tcMar>
@@ -1542,7 +1542,7 @@
             <w:tcBorders>
               <w:top w:val="none" w:color="FFFFFF" w:sz="0"/>
               <w:left w:val="none" w:color="FFFFFF" w:sz="0"/>
-              <w:bottom w:val="single" w:color="DCD3C3" w:sz="4"/>
+              <w:bottom w:val="single" w:color="DDD9E5" w:sz="4"/>
               <w:right w:val="none" w:color="FFFFFF" w:sz="0"/>
             </w:tcBorders>
             <w:tcMar>
@@ -1568,7 +1568,7 @@
             <w:tcBorders>
               <w:top w:val="none" w:color="FFFFFF" w:sz="0"/>
               <w:left w:val="none" w:color="FFFFFF" w:sz="0"/>
-              <w:bottom w:val="single" w:color="DCD3C3" w:sz="4"/>
+              <w:bottom w:val="single" w:color="DDD9E5" w:sz="4"/>
               <w:right w:val="none" w:color="FFFFFF" w:sz="0"/>
             </w:tcBorders>
             <w:tcMar>
@@ -1594,7 +1594,7 @@
             <w:tcBorders>
               <w:top w:val="none" w:color="FFFFFF" w:sz="0"/>
               <w:left w:val="none" w:color="FFFFFF" w:sz="0"/>
-              <w:bottom w:val="single" w:color="DCD3C3" w:sz="4"/>
+              <w:bottom w:val="single" w:color="DDD9E5" w:sz="4"/>
               <w:right w:val="none" w:color="FFFFFF" w:sz="0"/>
             </w:tcBorders>
             <w:tcMar>
@@ -1639,7 +1639,7 @@
             <w:tcBorders>
               <w:top w:val="none" w:color="FFFFFF" w:sz="0"/>
               <w:left w:val="none" w:color="FFFFFF" w:sz="0"/>
-              <w:bottom w:val="single" w:color="DCD3C3" w:sz="4"/>
+              <w:bottom w:val="single" w:color="DDD9E5" w:sz="4"/>
               <w:right w:val="none" w:color="FFFFFF" w:sz="0"/>
             </w:tcBorders>
             <w:tcMar>
@@ -1665,7 +1665,7 @@
             <w:tcBorders>
               <w:top w:val="none" w:color="FFFFFF" w:sz="0"/>
               <w:left w:val="none" w:color="FFFFFF" w:sz="0"/>
-              <w:bottom w:val="single" w:color="DCD3C3" w:sz="4"/>
+              <w:bottom w:val="single" w:color="DDD9E5" w:sz="4"/>
               <w:right w:val="none" w:color="FFFFFF" w:sz="0"/>
             </w:tcBorders>
             <w:tcMar>
@@ -1691,7 +1691,7 @@
             <w:tcBorders>
               <w:top w:val="none" w:color="FFFFFF" w:sz="0"/>
               <w:left w:val="none" w:color="FFFFFF" w:sz="0"/>
-              <w:bottom w:val="single" w:color="DCD3C3" w:sz="4"/>
+              <w:bottom w:val="single" w:color="DDD9E5" w:sz="4"/>
               <w:right w:val="none" w:color="FFFFFF" w:sz="0"/>
             </w:tcBorders>
             <w:tcMar>
@@ -1717,7 +1717,7 @@
             <w:tcBorders>
               <w:top w:val="none" w:color="FFFFFF" w:sz="0"/>
               <w:left w:val="none" w:color="FFFFFF" w:sz="0"/>
-              <w:bottom w:val="single" w:color="DCD3C3" w:sz="4"/>
+              <w:bottom w:val="single" w:color="DDD9E5" w:sz="4"/>
               <w:right w:val="none" w:color="FFFFFF" w:sz="0"/>
             </w:tcBorders>
             <w:tcMar>
@@ -1744,7 +1744,7 @@
             <w:tcBorders>
               <w:top w:val="none" w:color="FFFFFF" w:sz="0"/>
               <w:left w:val="none" w:color="FFFFFF" w:sz="0"/>
-              <w:bottom w:val="single" w:color="DCD3C3" w:sz="4"/>
+              <w:bottom w:val="single" w:color="DDD9E5" w:sz="4"/>
               <w:right w:val="none" w:color="FFFFFF" w:sz="0"/>
             </w:tcBorders>
             <w:tcMar>
@@ -1770,7 +1770,7 @@
             <w:tcBorders>
               <w:top w:val="none" w:color="FFFFFF" w:sz="0"/>
               <w:left w:val="none" w:color="FFFFFF" w:sz="0"/>
-              <w:bottom w:val="single" w:color="DCD3C3" w:sz="4"/>
+              <w:bottom w:val="single" w:color="DDD9E5" w:sz="4"/>
               <w:right w:val="none" w:color="FFFFFF" w:sz="0"/>
             </w:tcBorders>
             <w:tcMar>
@@ -1796,7 +1796,7 @@
             <w:tcBorders>
               <w:top w:val="none" w:color="FFFFFF" w:sz="0"/>
               <w:left w:val="none" w:color="FFFFFF" w:sz="0"/>
-              <w:bottom w:val="single" w:color="DCD3C3" w:sz="4"/>
+              <w:bottom w:val="single" w:color="DDD9E5" w:sz="4"/>
               <w:right w:val="none" w:color="FFFFFF" w:sz="0"/>
             </w:tcBorders>
             <w:tcMar>
@@ -1833,7 +1833,7 @@
             <w:tcBorders>
               <w:top w:val="none" w:color="FFFFFF" w:sz="0"/>
               <w:left w:val="none" w:color="FFFFFF" w:sz="0"/>
-              <w:bottom w:val="single" w:color="DCD3C3" w:sz="4"/>
+              <w:bottom w:val="single" w:color="DDD9E5" w:sz="4"/>
               <w:right w:val="none" w:color="FFFFFF" w:sz="0"/>
             </w:tcBorders>
             <w:tcMar>
@@ -1859,7 +1859,7 @@
             <w:tcBorders>
               <w:top w:val="none" w:color="FFFFFF" w:sz="0"/>
               <w:left w:val="none" w:color="FFFFFF" w:sz="0"/>
-              <w:bottom w:val="single" w:color="DCD3C3" w:sz="4"/>
+              <w:bottom w:val="single" w:color="DDD9E5" w:sz="4"/>
               <w:right w:val="none" w:color="FFFFFF" w:sz="0"/>
             </w:tcBorders>
             <w:tcMar>
@@ -1885,7 +1885,7 @@
             <w:tcBorders>
               <w:top w:val="none" w:color="FFFFFF" w:sz="0"/>
               <w:left w:val="none" w:color="FFFFFF" w:sz="0"/>
-              <w:bottom w:val="single" w:color="DCD3C3" w:sz="4"/>
+              <w:bottom w:val="single" w:color="DDD9E5" w:sz="4"/>
               <w:right w:val="none" w:color="FFFFFF" w:sz="0"/>
             </w:tcBorders>
             <w:tcMar>
@@ -1911,7 +1911,7 @@
             <w:tcBorders>
               <w:top w:val="none" w:color="FFFFFF" w:sz="0"/>
               <w:left w:val="none" w:color="FFFFFF" w:sz="0"/>
-              <w:bottom w:val="single" w:color="DCD3C3" w:sz="4"/>
+              <w:bottom w:val="single" w:color="DDD9E5" w:sz="4"/>
               <w:right w:val="none" w:color="FFFFFF" w:sz="0"/>
             </w:tcBorders>
             <w:tcMar>
@@ -1938,7 +1938,7 @@
             <w:tcBorders>
               <w:top w:val="none" w:color="FFFFFF" w:sz="0"/>
               <w:left w:val="none" w:color="FFFFFF" w:sz="0"/>
-              <w:bottom w:val="single" w:color="DCD3C3" w:sz="4"/>
+              <w:bottom w:val="single" w:color="DDD9E5" w:sz="4"/>
               <w:right w:val="none" w:color="FFFFFF" w:sz="0"/>
             </w:tcBorders>
             <w:tcMar>
@@ -1964,7 +1964,7 @@
             <w:tcBorders>
               <w:top w:val="none" w:color="FFFFFF" w:sz="0"/>
               <w:left w:val="none" w:color="FFFFFF" w:sz="0"/>
-              <w:bottom w:val="single" w:color="DCD3C3" w:sz="4"/>
+              <w:bottom w:val="single" w:color="DDD9E5" w:sz="4"/>
               <w:right w:val="none" w:color="FFFFFF" w:sz="0"/>
             </w:tcBorders>
             <w:tcMar>
@@ -1990,7 +1990,7 @@
             <w:tcBorders>
               <w:top w:val="none" w:color="FFFFFF" w:sz="0"/>
               <w:left w:val="none" w:color="FFFFFF" w:sz="0"/>
-              <w:bottom w:val="single" w:color="DCD3C3" w:sz="4"/>
+              <w:bottom w:val="single" w:color="DDD9E5" w:sz="4"/>
               <w:right w:val="none" w:color="FFFFFF" w:sz="0"/>
             </w:tcBorders>
             <w:tcMar>
@@ -2035,7 +2035,7 @@
             <w:tcBorders>
               <w:top w:val="none" w:color="FFFFFF" w:sz="0"/>
               <w:left w:val="none" w:color="FFFFFF" w:sz="0"/>
-              <w:bottom w:val="single" w:color="DCD3C3" w:sz="4"/>
+              <w:bottom w:val="single" w:color="DDD9E5" w:sz="4"/>
               <w:right w:val="none" w:color="FFFFFF" w:sz="0"/>
             </w:tcBorders>
             <w:tcMar>
@@ -2061,7 +2061,7 @@
             <w:tcBorders>
               <w:top w:val="none" w:color="FFFFFF" w:sz="0"/>
               <w:left w:val="none" w:color="FFFFFF" w:sz="0"/>
-              <w:bottom w:val="single" w:color="DCD3C3" w:sz="4"/>
+              <w:bottom w:val="single" w:color="DDD9E5" w:sz="4"/>
               <w:right w:val="none" w:color="FFFFFF" w:sz="0"/>
             </w:tcBorders>
             <w:tcMar>
@@ -2087,7 +2087,7 @@
             <w:tcBorders>
               <w:top w:val="none" w:color="FFFFFF" w:sz="0"/>
               <w:left w:val="none" w:color="FFFFFF" w:sz="0"/>
-              <w:bottom w:val="single" w:color="DCD3C3" w:sz="4"/>
+              <w:bottom w:val="single" w:color="DDD9E5" w:sz="4"/>
               <w:right w:val="none" w:color="FFFFFF" w:sz="0"/>
             </w:tcBorders>
             <w:tcMar>
@@ -2113,7 +2113,7 @@
             <w:tcBorders>
               <w:top w:val="none" w:color="FFFFFF" w:sz="0"/>
               <w:left w:val="none" w:color="FFFFFF" w:sz="0"/>
-              <w:bottom w:val="single" w:color="DCD3C3" w:sz="4"/>
+              <w:bottom w:val="single" w:color="DDD9E5" w:sz="4"/>
               <w:right w:val="none" w:color="FFFFFF" w:sz="0"/>
             </w:tcBorders>
             <w:tcMar>
@@ -2140,7 +2140,7 @@
             <w:tcBorders>
               <w:top w:val="none" w:color="FFFFFF" w:sz="0"/>
               <w:left w:val="none" w:color="FFFFFF" w:sz="0"/>
-              <w:bottom w:val="single" w:color="DCD3C3" w:sz="4"/>
+              <w:bottom w:val="single" w:color="DDD9E5" w:sz="4"/>
               <w:right w:val="none" w:color="FFFFFF" w:sz="0"/>
             </w:tcBorders>
             <w:tcMar>
@@ -2166,7 +2166,7 @@
             <w:tcBorders>
               <w:top w:val="none" w:color="FFFFFF" w:sz="0"/>
               <w:left w:val="none" w:color="FFFFFF" w:sz="0"/>
-              <w:bottom w:val="single" w:color="DCD3C3" w:sz="4"/>
+              <w:bottom w:val="single" w:color="DDD9E5" w:sz="4"/>
               <w:right w:val="none" w:color="FFFFFF" w:sz="0"/>
             </w:tcBorders>
             <w:tcMar>
@@ -2192,7 +2192,7 @@
             <w:tcBorders>
               <w:top w:val="none" w:color="FFFFFF" w:sz="0"/>
               <w:left w:val="none" w:color="FFFFFF" w:sz="0"/>
-              <w:bottom w:val="single" w:color="DCD3C3" w:sz="4"/>
+              <w:bottom w:val="single" w:color="DDD9E5" w:sz="4"/>
               <w:right w:val="none" w:color="FFFFFF" w:sz="0"/>
             </w:tcBorders>
             <w:tcMar>
@@ -2222,7 +2222,7 @@
             <w:tcBorders>
               <w:top w:val="none" w:color="FFFFFF" w:sz="0"/>
               <w:left w:val="none" w:color="FFFFFF" w:sz="0"/>
-              <w:bottom w:val="single" w:color="DCD3C3" w:sz="4"/>
+              <w:bottom w:val="single" w:color="DDD9E5" w:sz="4"/>
               <w:right w:val="none" w:color="FFFFFF" w:sz="0"/>
             </w:tcBorders>
             <w:tcMar>
@@ -2248,7 +2248,7 @@
             <w:tcBorders>
               <w:top w:val="none" w:color="FFFFFF" w:sz="0"/>
               <w:left w:val="none" w:color="FFFFFF" w:sz="0"/>
-              <w:bottom w:val="single" w:color="DCD3C3" w:sz="4"/>
+              <w:bottom w:val="single" w:color="DDD9E5" w:sz="4"/>
               <w:right w:val="none" w:color="FFFFFF" w:sz="0"/>
             </w:tcBorders>
             <w:tcMar>
@@ -2274,7 +2274,7 @@
             <w:tcBorders>
               <w:top w:val="none" w:color="FFFFFF" w:sz="0"/>
               <w:left w:val="none" w:color="FFFFFF" w:sz="0"/>
-              <w:bottom w:val="single" w:color="DCD3C3" w:sz="4"/>
+              <w:bottom w:val="single" w:color="DDD9E5" w:sz="4"/>
               <w:right w:val="none" w:color="FFFFFF" w:sz="0"/>
             </w:tcBorders>
             <w:tcMar>
@@ -2300,7 +2300,7 @@
             <w:tcBorders>
               <w:top w:val="none" w:color="FFFFFF" w:sz="0"/>
               <w:left w:val="none" w:color="FFFFFF" w:sz="0"/>
-              <w:bottom w:val="single" w:color="DCD3C3" w:sz="4"/>
+              <w:bottom w:val="single" w:color="DDD9E5" w:sz="4"/>
               <w:right w:val="none" w:color="FFFFFF" w:sz="0"/>
             </w:tcBorders>
             <w:tcMar>
@@ -2342,7 +2342,7 @@
             <w:tcBorders>
               <w:top w:val="none" w:color="FFFFFF" w:sz="0"/>
               <w:left w:val="none" w:color="FFFFFF" w:sz="0"/>
-              <w:bottom w:val="single" w:color="DCD3C3" w:sz="4"/>
+              <w:bottom w:val="single" w:color="DDD9E5" w:sz="4"/>
               <w:right w:val="none" w:color="FFFFFF" w:sz="0"/>
             </w:tcBorders>
             <w:tcMar>
@@ -2368,7 +2368,7 @@
             <w:tcBorders>
               <w:top w:val="none" w:color="FFFFFF" w:sz="0"/>
               <w:left w:val="none" w:color="FFFFFF" w:sz="0"/>
-              <w:bottom w:val="single" w:color="DCD3C3" w:sz="4"/>
+              <w:bottom w:val="single" w:color="DDD9E5" w:sz="4"/>
               <w:right w:val="none" w:color="FFFFFF" w:sz="0"/>
             </w:tcBorders>
             <w:tcMar>
@@ -2403,7 +2403,7 @@
             <w:tcBorders>
               <w:top w:val="none" w:color="FFFFFF" w:sz="0"/>
               <w:left w:val="none" w:color="FFFFFF" w:sz="0"/>
-              <w:bottom w:val="single" w:color="DCD3C3" w:sz="4"/>
+              <w:bottom w:val="single" w:color="DDD9E5" w:sz="4"/>
               <w:right w:val="none" w:color="FFFFFF" w:sz="0"/>
             </w:tcBorders>
             <w:tcMar>
@@ -2440,7 +2440,7 @@
             <w:tcBorders>
               <w:top w:val="none" w:color="FFFFFF" w:sz="0"/>
               <w:left w:val="none" w:color="FFFFFF" w:sz="0"/>
-              <w:bottom w:val="single" w:color="DCD3C3" w:sz="4"/>
+              <w:bottom w:val="single" w:color="DDD9E5" w:sz="4"/>
               <w:right w:val="none" w:color="FFFFFF" w:sz="0"/>
             </w:tcBorders>
             <w:tcMar>
@@ -2466,7 +2466,7 @@
             <w:tcBorders>
               <w:top w:val="none" w:color="FFFFFF" w:sz="0"/>
               <w:left w:val="none" w:color="FFFFFF" w:sz="0"/>
-              <w:bottom w:val="single" w:color="DCD3C3" w:sz="4"/>
+              <w:bottom w:val="single" w:color="DDD9E5" w:sz="4"/>
               <w:right w:val="none" w:color="FFFFFF" w:sz="0"/>
             </w:tcBorders>
             <w:tcMar>
@@ -2492,7 +2492,7 @@
             <w:tcBorders>
               <w:top w:val="none" w:color="FFFFFF" w:sz="0"/>
               <w:left w:val="none" w:color="FFFFFF" w:sz="0"/>
-              <w:bottom w:val="single" w:color="DCD3C3" w:sz="4"/>
+              <w:bottom w:val="single" w:color="DDD9E5" w:sz="4"/>
               <w:right w:val="none" w:color="FFFFFF" w:sz="0"/>
             </w:tcBorders>
             <w:tcMar>
@@ -2518,7 +2518,7 @@
             <w:tcBorders>
               <w:top w:val="none" w:color="FFFFFF" w:sz="0"/>
               <w:left w:val="none" w:color="FFFFFF" w:sz="0"/>
-              <w:bottom w:val="single" w:color="DCD3C3" w:sz="4"/>
+              <w:bottom w:val="single" w:color="DDD9E5" w:sz="4"/>
               <w:right w:val="none" w:color="FFFFFF" w:sz="0"/>
             </w:tcBorders>
             <w:tcMar>
@@ -2545,7 +2545,7 @@
             <w:tcBorders>
               <w:top w:val="none" w:color="FFFFFF" w:sz="0"/>
               <w:left w:val="none" w:color="FFFFFF" w:sz="0"/>
-              <w:bottom w:val="single" w:color="DCD3C3" w:sz="4"/>
+              <w:bottom w:val="single" w:color="DDD9E5" w:sz="4"/>
               <w:right w:val="none" w:color="FFFFFF" w:sz="0"/>
             </w:tcBorders>
             <w:tcMar>
@@ -2571,7 +2571,7 @@
             <w:tcBorders>
               <w:top w:val="none" w:color="FFFFFF" w:sz="0"/>
               <w:left w:val="none" w:color="FFFFFF" w:sz="0"/>
-              <w:bottom w:val="single" w:color="DCD3C3" w:sz="4"/>
+              <w:bottom w:val="single" w:color="DDD9E5" w:sz="4"/>
               <w:right w:val="none" w:color="FFFFFF" w:sz="0"/>
             </w:tcBorders>
             <w:tcMar>
@@ -2613,7 +2613,7 @@
             <w:tcBorders>
               <w:top w:val="none" w:color="FFFFFF" w:sz="0"/>
               <w:left w:val="none" w:color="FFFFFF" w:sz="0"/>
-              <w:bottom w:val="single" w:color="DCD3C3" w:sz="4"/>
+              <w:bottom w:val="single" w:color="DDD9E5" w:sz="4"/>
               <w:right w:val="none" w:color="FFFFFF" w:sz="0"/>
             </w:tcBorders>
             <w:tcMar>
@@ -2658,7 +2658,7 @@
             <w:tcBorders>
               <w:top w:val="none" w:color="FFFFFF" w:sz="0"/>
               <w:left w:val="none" w:color="FFFFFF" w:sz="0"/>
-              <w:bottom w:val="single" w:color="DCD3C3" w:sz="4"/>
+              <w:bottom w:val="single" w:color="DDD9E5" w:sz="4"/>
               <w:right w:val="none" w:color="FFFFFF" w:sz="0"/>
             </w:tcBorders>
             <w:tcMar>
@@ -2684,7 +2684,7 @@
             <w:tcBorders>
               <w:top w:val="none" w:color="FFFFFF" w:sz="0"/>
               <w:left w:val="none" w:color="FFFFFF" w:sz="0"/>
-              <w:bottom w:val="single" w:color="DCD3C3" w:sz="4"/>
+              <w:bottom w:val="single" w:color="DDD9E5" w:sz="4"/>
               <w:right w:val="none" w:color="FFFFFF" w:sz="0"/>
             </w:tcBorders>
             <w:tcMar>
@@ -2710,7 +2710,7 @@
             <w:tcBorders>
               <w:top w:val="none" w:color="FFFFFF" w:sz="0"/>
               <w:left w:val="none" w:color="FFFFFF" w:sz="0"/>
-              <w:bottom w:val="single" w:color="DCD3C3" w:sz="4"/>
+              <w:bottom w:val="single" w:color="DDD9E5" w:sz="4"/>
               <w:right w:val="none" w:color="FFFFFF" w:sz="0"/>
             </w:tcBorders>
             <w:tcMar>
@@ -2736,7 +2736,7 @@
             <w:tcBorders>
               <w:top w:val="none" w:color="FFFFFF" w:sz="0"/>
               <w:left w:val="none" w:color="FFFFFF" w:sz="0"/>
-              <w:bottom w:val="single" w:color="DCD3C3" w:sz="4"/>
+              <w:bottom w:val="single" w:color="DDD9E5" w:sz="4"/>
               <w:right w:val="none" w:color="FFFFFF" w:sz="0"/>
             </w:tcBorders>
             <w:tcMar>
@@ -2763,7 +2763,7 @@
             <w:tcBorders>
               <w:top w:val="none" w:color="FFFFFF" w:sz="0"/>
               <w:left w:val="none" w:color="FFFFFF" w:sz="0"/>
-              <w:bottom w:val="single" w:color="DCD3C3" w:sz="4"/>
+              <w:bottom w:val="single" w:color="DDD9E5" w:sz="4"/>
               <w:right w:val="none" w:color="FFFFFF" w:sz="0"/>
             </w:tcBorders>
             <w:tcMar>
@@ -2789,7 +2789,7 @@
             <w:tcBorders>
               <w:top w:val="none" w:color="FFFFFF" w:sz="0"/>
               <w:left w:val="none" w:color="FFFFFF" w:sz="0"/>
-              <w:bottom w:val="single" w:color="DCD3C3" w:sz="4"/>
+              <w:bottom w:val="single" w:color="DDD9E5" w:sz="4"/>
               <w:right w:val="none" w:color="FFFFFF" w:sz="0"/>
             </w:tcBorders>
             <w:tcMar>
@@ -2831,7 +2831,7 @@
             <w:tcBorders>
               <w:top w:val="none" w:color="FFFFFF" w:sz="0"/>
               <w:left w:val="none" w:color="FFFFFF" w:sz="0"/>
-              <w:bottom w:val="single" w:color="DCD3C3" w:sz="4"/>
+              <w:bottom w:val="single" w:color="DDD9E5" w:sz="4"/>
               <w:right w:val="none" w:color="FFFFFF" w:sz="0"/>
             </w:tcBorders>
             <w:tcMar>
@@ -3012,7 +3012,7 @@
               <w:bottom w:val="none" w:color="FFFFFF" w:sz="0"/>
               <w:right w:val="none" w:color="FFFFFF" w:sz="0"/>
             </w:tcBorders>
-            <w:shd w:fill="FAEDDC" w:color="auto" w:val="clear"/>
+            <w:shd w:fill="EFE7FF" w:color="auto" w:val="clear"/>
             <w:tcMar>
               <w:top w:type="dxa" w:w="70"/>
               <w:left w:type="dxa" w:w="110"/>
@@ -3029,7 +3029,7 @@
                 <w:rFonts w:ascii="Arial" w:cs="Arial" w:eastAsia="Arial" w:hAnsi="Arial"/>
                 <w:b/>
                 <w:bCs/>
-                <w:color w:val="D98324"/>
+                <w:color w:val="6D3FD1"/>
                 <w:spacing w:val="20"/>
                 <w:sz w:val="15"/>
                 <w:szCs w:val="15"/>
@@ -3127,7 +3127,7 @@
           <w:rFonts w:ascii="Arial" w:cs="Arial" w:eastAsia="Arial" w:hAnsi="Arial"/>
           <w:b/>
           <w:bCs/>
-          <w:color w:val="7C766B"/>
+          <w:color w:val="6C6873"/>
           <w:spacing w:val="20"/>
           <w:sz w:val="15"/>
           <w:szCs w:val="15"/>
@@ -3180,10 +3180,10 @@
             <w:tcBorders>
               <w:top w:val="none" w:color="FFFFFF" w:sz="0"/>
               <w:left w:val="none" w:color="FFFFFF" w:sz="0"/>
-              <w:bottom w:val="single" w:color="DCD3C3" w:sz="4"/>
-              <w:right w:val="none" w:color="FFFFFF" w:sz="0"/>
-            </w:tcBorders>
-            <w:shd w:fill="F1ECE3" w:color="auto" w:val="clear"/>
+              <w:bottom w:val="single" w:color="DDD9E5" w:sz="4"/>
+              <w:right w:val="none" w:color="FFFFFF" w:sz="0"/>
+            </w:tcBorders>
+            <w:shd w:fill="F6F4F9" w:color="auto" w:val="clear"/>
             <w:tcMar>
               <w:top w:type="dxa" w:w="70"/>
               <w:left w:type="dxa" w:w="110"/>
@@ -3209,10 +3209,10 @@
             <w:tcBorders>
               <w:top w:val="none" w:color="FFFFFF" w:sz="0"/>
               <w:left w:val="none" w:color="FFFFFF" w:sz="0"/>
-              <w:bottom w:val="single" w:color="DCD3C3" w:sz="4"/>
-              <w:right w:val="none" w:color="FFFFFF" w:sz="0"/>
-            </w:tcBorders>
-            <w:shd w:fill="F1ECE3" w:color="auto" w:val="clear"/>
+              <w:bottom w:val="single" w:color="DDD9E5" w:sz="4"/>
+              <w:right w:val="none" w:color="FFFFFF" w:sz="0"/>
+            </w:tcBorders>
+            <w:shd w:fill="F6F4F9" w:color="auto" w:val="clear"/>
             <w:tcMar>
               <w:top w:type="dxa" w:w="70"/>
               <w:left w:type="dxa" w:w="110"/>
@@ -3238,10 +3238,10 @@
             <w:tcBorders>
               <w:top w:val="none" w:color="FFFFFF" w:sz="0"/>
               <w:left w:val="none" w:color="FFFFFF" w:sz="0"/>
-              <w:bottom w:val="single" w:color="DCD3C3" w:sz="4"/>
-              <w:right w:val="none" w:color="FFFFFF" w:sz="0"/>
-            </w:tcBorders>
-            <w:shd w:fill="F1ECE3" w:color="auto" w:val="clear"/>
+              <w:bottom w:val="single" w:color="DDD9E5" w:sz="4"/>
+              <w:right w:val="none" w:color="FFFFFF" w:sz="0"/>
+            </w:tcBorders>
+            <w:shd w:fill="F6F4F9" w:color="auto" w:val="clear"/>
             <w:tcMar>
               <w:top w:type="dxa" w:w="70"/>
               <w:left w:type="dxa" w:w="110"/>
@@ -3267,10 +3267,10 @@
             <w:tcBorders>
               <w:top w:val="none" w:color="FFFFFF" w:sz="0"/>
               <w:left w:val="none" w:color="FFFFFF" w:sz="0"/>
-              <w:bottom w:val="single" w:color="DCD3C3" w:sz="4"/>
-              <w:right w:val="none" w:color="FFFFFF" w:sz="0"/>
-            </w:tcBorders>
-            <w:shd w:fill="F1ECE3" w:color="auto" w:val="clear"/>
+              <w:bottom w:val="single" w:color="DDD9E5" w:sz="4"/>
+              <w:right w:val="none" w:color="FFFFFF" w:sz="0"/>
+            </w:tcBorders>
+            <w:shd w:fill="F6F4F9" w:color="auto" w:val="clear"/>
             <w:tcMar>
               <w:top w:type="dxa" w:w="70"/>
               <w:left w:type="dxa" w:w="110"/>
@@ -3296,10 +3296,10 @@
             <w:tcBorders>
               <w:top w:val="none" w:color="FFFFFF" w:sz="0"/>
               <w:left w:val="none" w:color="FFFFFF" w:sz="0"/>
-              <w:bottom w:val="single" w:color="DCD3C3" w:sz="4"/>
-              <w:right w:val="none" w:color="FFFFFF" w:sz="0"/>
-            </w:tcBorders>
-            <w:shd w:fill="F1ECE3" w:color="auto" w:val="clear"/>
+              <w:bottom w:val="single" w:color="DDD9E5" w:sz="4"/>
+              <w:right w:val="none" w:color="FFFFFF" w:sz="0"/>
+            </w:tcBorders>
+            <w:shd w:fill="F6F4F9" w:color="auto" w:val="clear"/>
             <w:tcMar>
               <w:top w:type="dxa" w:w="70"/>
               <w:left w:type="dxa" w:w="110"/>
@@ -3325,10 +3325,10 @@
             <w:tcBorders>
               <w:top w:val="none" w:color="FFFFFF" w:sz="0"/>
               <w:left w:val="none" w:color="FFFFFF" w:sz="0"/>
-              <w:bottom w:val="single" w:color="DCD3C3" w:sz="4"/>
-              <w:right w:val="none" w:color="FFFFFF" w:sz="0"/>
-            </w:tcBorders>
-            <w:shd w:fill="F1ECE3" w:color="auto" w:val="clear"/>
+              <w:bottom w:val="single" w:color="DDD9E5" w:sz="4"/>
+              <w:right w:val="none" w:color="FFFFFF" w:sz="0"/>
+            </w:tcBorders>
+            <w:shd w:fill="F6F4F9" w:color="auto" w:val="clear"/>
             <w:tcMar>
               <w:top w:type="dxa" w:w="70"/>
               <w:left w:type="dxa" w:w="110"/>
@@ -3356,7 +3356,7 @@
             <w:tcBorders>
               <w:top w:val="none" w:color="FFFFFF" w:sz="0"/>
               <w:left w:val="none" w:color="FFFFFF" w:sz="0"/>
-              <w:bottom w:val="single" w:color="DCD3C3" w:sz="4"/>
+              <w:bottom w:val="single" w:color="DDD9E5" w:sz="4"/>
               <w:right w:val="none" w:color="FFFFFF" w:sz="0"/>
             </w:tcBorders>
             <w:tcMar>
@@ -3382,7 +3382,7 @@
             <w:tcBorders>
               <w:top w:val="none" w:color="FFFFFF" w:sz="0"/>
               <w:left w:val="none" w:color="FFFFFF" w:sz="0"/>
-              <w:bottom w:val="single" w:color="DCD3C3" w:sz="4"/>
+              <w:bottom w:val="single" w:color="DDD9E5" w:sz="4"/>
               <w:right w:val="none" w:color="FFFFFF" w:sz="0"/>
             </w:tcBorders>
             <w:tcMar>
@@ -3408,7 +3408,7 @@
             <w:tcBorders>
               <w:top w:val="none" w:color="FFFFFF" w:sz="0"/>
               <w:left w:val="none" w:color="FFFFFF" w:sz="0"/>
-              <w:bottom w:val="single" w:color="DCD3C3" w:sz="4"/>
+              <w:bottom w:val="single" w:color="DDD9E5" w:sz="4"/>
               <w:right w:val="none" w:color="FFFFFF" w:sz="0"/>
             </w:tcBorders>
             <w:tcMar>
@@ -3435,7 +3435,7 @@
             <w:tcBorders>
               <w:top w:val="none" w:color="FFFFFF" w:sz="0"/>
               <w:left w:val="none" w:color="FFFFFF" w:sz="0"/>
-              <w:bottom w:val="single" w:color="DCD3C3" w:sz="4"/>
+              <w:bottom w:val="single" w:color="DDD9E5" w:sz="4"/>
               <w:right w:val="none" w:color="FFFFFF" w:sz="0"/>
             </w:tcBorders>
             <w:tcMar>
@@ -3461,7 +3461,7 @@
             <w:tcBorders>
               <w:top w:val="none" w:color="FFFFFF" w:sz="0"/>
               <w:left w:val="none" w:color="FFFFFF" w:sz="0"/>
-              <w:bottom w:val="single" w:color="DCD3C3" w:sz="4"/>
+              <w:bottom w:val="single" w:color="DDD9E5" w:sz="4"/>
               <w:right w:val="none" w:color="FFFFFF" w:sz="0"/>
             </w:tcBorders>
             <w:tcMar>
@@ -3503,7 +3503,7 @@
             <w:tcBorders>
               <w:top w:val="none" w:color="FFFFFF" w:sz="0"/>
               <w:left w:val="none" w:color="FFFFFF" w:sz="0"/>
-              <w:bottom w:val="single" w:color="DCD3C3" w:sz="4"/>
+              <w:bottom w:val="single" w:color="DDD9E5" w:sz="4"/>
               <w:right w:val="none" w:color="FFFFFF" w:sz="0"/>
             </w:tcBorders>
             <w:tcMar>
@@ -3547,7 +3547,7 @@
             <w:tcBorders>
               <w:top w:val="none" w:color="FFFFFF" w:sz="0"/>
               <w:left w:val="none" w:color="FFFFFF" w:sz="0"/>
-              <w:bottom w:val="single" w:color="DCD3C3" w:sz="4"/>
+              <w:bottom w:val="single" w:color="DDD9E5" w:sz="4"/>
               <w:right w:val="none" w:color="FFFFFF" w:sz="0"/>
             </w:tcBorders>
             <w:tcMar>
@@ -3573,7 +3573,7 @@
             <w:tcBorders>
               <w:top w:val="none" w:color="FFFFFF" w:sz="0"/>
               <w:left w:val="none" w:color="FFFFFF" w:sz="0"/>
-              <w:bottom w:val="single" w:color="DCD3C3" w:sz="4"/>
+              <w:bottom w:val="single" w:color="DDD9E5" w:sz="4"/>
               <w:right w:val="none" w:color="FFFFFF" w:sz="0"/>
             </w:tcBorders>
             <w:tcMar>
@@ -3599,7 +3599,7 @@
             <w:tcBorders>
               <w:top w:val="none" w:color="FFFFFF" w:sz="0"/>
               <w:left w:val="none" w:color="FFFFFF" w:sz="0"/>
-              <w:bottom w:val="single" w:color="DCD3C3" w:sz="4"/>
+              <w:bottom w:val="single" w:color="DDD9E5" w:sz="4"/>
               <w:right w:val="none" w:color="FFFFFF" w:sz="0"/>
             </w:tcBorders>
             <w:tcMar>
@@ -3626,7 +3626,7 @@
             <w:tcBorders>
               <w:top w:val="none" w:color="FFFFFF" w:sz="0"/>
               <w:left w:val="none" w:color="FFFFFF" w:sz="0"/>
-              <w:bottom w:val="single" w:color="DCD3C3" w:sz="4"/>
+              <w:bottom w:val="single" w:color="DDD9E5" w:sz="4"/>
               <w:right w:val="none" w:color="FFFFFF" w:sz="0"/>
             </w:tcBorders>
             <w:tcMar>
@@ -3652,7 +3652,7 @@
             <w:tcBorders>
               <w:top w:val="none" w:color="FFFFFF" w:sz="0"/>
               <w:left w:val="none" w:color="FFFFFF" w:sz="0"/>
-              <w:bottom w:val="single" w:color="DCD3C3" w:sz="4"/>
+              <w:bottom w:val="single" w:color="DDD9E5" w:sz="4"/>
               <w:right w:val="none" w:color="FFFFFF" w:sz="0"/>
             </w:tcBorders>
             <w:tcMar>
@@ -3694,7 +3694,7 @@
             <w:tcBorders>
               <w:top w:val="none" w:color="FFFFFF" w:sz="0"/>
               <w:left w:val="none" w:color="FFFFFF" w:sz="0"/>
-              <w:bottom w:val="single" w:color="DCD3C3" w:sz="4"/>
+              <w:bottom w:val="single" w:color="DDD9E5" w:sz="4"/>
               <w:right w:val="none" w:color="FFFFFF" w:sz="0"/>
             </w:tcBorders>
             <w:tcMar>
@@ -3731,7 +3731,7 @@
             <w:tcBorders>
               <w:top w:val="none" w:color="FFFFFF" w:sz="0"/>
               <w:left w:val="none" w:color="FFFFFF" w:sz="0"/>
-              <w:bottom w:val="single" w:color="DCD3C3" w:sz="4"/>
+              <w:bottom w:val="single" w:color="DDD9E5" w:sz="4"/>
               <w:right w:val="none" w:color="FFFFFF" w:sz="0"/>
             </w:tcBorders>
             <w:tcMar>
@@ -3757,7 +3757,7 @@
             <w:tcBorders>
               <w:top w:val="none" w:color="FFFFFF" w:sz="0"/>
               <w:left w:val="none" w:color="FFFFFF" w:sz="0"/>
-              <w:bottom w:val="single" w:color="DCD3C3" w:sz="4"/>
+              <w:bottom w:val="single" w:color="DDD9E5" w:sz="4"/>
               <w:right w:val="none" w:color="FFFFFF" w:sz="0"/>
             </w:tcBorders>
             <w:tcMar>
@@ -3783,7 +3783,7 @@
             <w:tcBorders>
               <w:top w:val="none" w:color="FFFFFF" w:sz="0"/>
               <w:left w:val="none" w:color="FFFFFF" w:sz="0"/>
-              <w:bottom w:val="single" w:color="DCD3C3" w:sz="4"/>
+              <w:bottom w:val="single" w:color="DDD9E5" w:sz="4"/>
               <w:right w:val="none" w:color="FFFFFF" w:sz="0"/>
             </w:tcBorders>
             <w:tcMar>
@@ -3810,7 +3810,7 @@
             <w:tcBorders>
               <w:top w:val="none" w:color="FFFFFF" w:sz="0"/>
               <w:left w:val="none" w:color="FFFFFF" w:sz="0"/>
-              <w:bottom w:val="single" w:color="DCD3C3" w:sz="4"/>
+              <w:bottom w:val="single" w:color="DDD9E5" w:sz="4"/>
               <w:right w:val="none" w:color="FFFFFF" w:sz="0"/>
             </w:tcBorders>
             <w:tcMar>
@@ -3836,7 +3836,7 @@
             <w:tcBorders>
               <w:top w:val="none" w:color="FFFFFF" w:sz="0"/>
               <w:left w:val="none" w:color="FFFFFF" w:sz="0"/>
-              <w:bottom w:val="single" w:color="DCD3C3" w:sz="4"/>
+              <w:bottom w:val="single" w:color="DDD9E5" w:sz="4"/>
               <w:right w:val="none" w:color="FFFFFF" w:sz="0"/>
             </w:tcBorders>
             <w:tcMar>
@@ -3878,7 +3878,7 @@
             <w:tcBorders>
               <w:top w:val="none" w:color="FFFFFF" w:sz="0"/>
               <w:left w:val="none" w:color="FFFFFF" w:sz="0"/>
-              <w:bottom w:val="single" w:color="DCD3C3" w:sz="4"/>
+              <w:bottom w:val="single" w:color="DDD9E5" w:sz="4"/>
               <w:right w:val="none" w:color="FFFFFF" w:sz="0"/>
             </w:tcBorders>
             <w:tcMar>
@@ -3922,7 +3922,7 @@
             <w:tcBorders>
               <w:top w:val="none" w:color="FFFFFF" w:sz="0"/>
               <w:left w:val="none" w:color="FFFFFF" w:sz="0"/>
-              <w:bottom w:val="single" w:color="DCD3C3" w:sz="4"/>
+              <w:bottom w:val="single" w:color="DDD9E5" w:sz="4"/>
               <w:right w:val="none" w:color="FFFFFF" w:sz="0"/>
             </w:tcBorders>
             <w:tcMar>
@@ -3948,7 +3948,7 @@
             <w:tcBorders>
               <w:top w:val="none" w:color="FFFFFF" w:sz="0"/>
               <w:left w:val="none" w:color="FFFFFF" w:sz="0"/>
-              <w:bottom w:val="single" w:color="DCD3C3" w:sz="4"/>
+              <w:bottom w:val="single" w:color="DDD9E5" w:sz="4"/>
               <w:right w:val="none" w:color="FFFFFF" w:sz="0"/>
             </w:tcBorders>
             <w:tcMar>
@@ -3974,7 +3974,7 @@
             <w:tcBorders>
               <w:top w:val="none" w:color="FFFFFF" w:sz="0"/>
               <w:left w:val="none" w:color="FFFFFF" w:sz="0"/>
-              <w:bottom w:val="single" w:color="DCD3C3" w:sz="4"/>
+              <w:bottom w:val="single" w:color="DDD9E5" w:sz="4"/>
               <w:right w:val="none" w:color="FFFFFF" w:sz="0"/>
             </w:tcBorders>
             <w:tcMar>
@@ -4001,7 +4001,7 @@
             <w:tcBorders>
               <w:top w:val="none" w:color="FFFFFF" w:sz="0"/>
               <w:left w:val="none" w:color="FFFFFF" w:sz="0"/>
-              <w:bottom w:val="single" w:color="DCD3C3" w:sz="4"/>
+              <w:bottom w:val="single" w:color="DDD9E5" w:sz="4"/>
               <w:right w:val="none" w:color="FFFFFF" w:sz="0"/>
             </w:tcBorders>
             <w:tcMar>
@@ -4027,7 +4027,7 @@
             <w:tcBorders>
               <w:top w:val="none" w:color="FFFFFF" w:sz="0"/>
               <w:left w:val="none" w:color="FFFFFF" w:sz="0"/>
-              <w:bottom w:val="single" w:color="DCD3C3" w:sz="4"/>
+              <w:bottom w:val="single" w:color="DDD9E5" w:sz="4"/>
               <w:right w:val="none" w:color="FFFFFF" w:sz="0"/>
             </w:tcBorders>
             <w:tcMar>
@@ -4053,7 +4053,7 @@
             <w:tcBorders>
               <w:top w:val="none" w:color="FFFFFF" w:sz="0"/>
               <w:left w:val="none" w:color="FFFFFF" w:sz="0"/>
-              <w:bottom w:val="single" w:color="DCD3C3" w:sz="4"/>
+              <w:bottom w:val="single" w:color="DDD9E5" w:sz="4"/>
               <w:right w:val="none" w:color="FFFFFF" w:sz="0"/>
             </w:tcBorders>
             <w:tcMar>
@@ -4090,7 +4090,7 @@
             <w:tcBorders>
               <w:top w:val="none" w:color="FFFFFF" w:sz="0"/>
               <w:left w:val="none" w:color="FFFFFF" w:sz="0"/>
-              <w:bottom w:val="single" w:color="DCD3C3" w:sz="4"/>
+              <w:bottom w:val="single" w:color="DDD9E5" w:sz="4"/>
               <w:right w:val="none" w:color="FFFFFF" w:sz="0"/>
             </w:tcBorders>
             <w:tcMar>
@@ -4116,7 +4116,7 @@
             <w:tcBorders>
               <w:top w:val="none" w:color="FFFFFF" w:sz="0"/>
               <w:left w:val="none" w:color="FFFFFF" w:sz="0"/>
-              <w:bottom w:val="single" w:color="DCD3C3" w:sz="4"/>
+              <w:bottom w:val="single" w:color="DDD9E5" w:sz="4"/>
               <w:right w:val="none" w:color="FFFFFF" w:sz="0"/>
             </w:tcBorders>
             <w:tcMar>
@@ -4142,7 +4142,7 @@
             <w:tcBorders>
               <w:top w:val="none" w:color="FFFFFF" w:sz="0"/>
               <w:left w:val="none" w:color="FFFFFF" w:sz="0"/>
-              <w:bottom w:val="single" w:color="DCD3C3" w:sz="4"/>
+              <w:bottom w:val="single" w:color="DDD9E5" w:sz="4"/>
               <w:right w:val="none" w:color="FFFFFF" w:sz="0"/>
             </w:tcBorders>
             <w:tcMar>
@@ -4169,7 +4169,7 @@
             <w:tcBorders>
               <w:top w:val="none" w:color="FFFFFF" w:sz="0"/>
               <w:left w:val="none" w:color="FFFFFF" w:sz="0"/>
-              <w:bottom w:val="single" w:color="DCD3C3" w:sz="4"/>
+              <w:bottom w:val="single" w:color="DDD9E5" w:sz="4"/>
               <w:right w:val="none" w:color="FFFFFF" w:sz="0"/>
             </w:tcBorders>
             <w:tcMar>
@@ -4195,7 +4195,7 @@
             <w:tcBorders>
               <w:top w:val="none" w:color="FFFFFF" w:sz="0"/>
               <w:left w:val="none" w:color="FFFFFF" w:sz="0"/>
-              <w:bottom w:val="single" w:color="DCD3C3" w:sz="4"/>
+              <w:bottom w:val="single" w:color="DDD9E5" w:sz="4"/>
               <w:right w:val="none" w:color="FFFFFF" w:sz="0"/>
             </w:tcBorders>
             <w:tcMar>
@@ -4252,7 +4252,7 @@
             <w:tcBorders>
               <w:top w:val="none" w:color="FFFFFF" w:sz="0"/>
               <w:left w:val="none" w:color="FFFFFF" w:sz="0"/>
-              <w:bottom w:val="single" w:color="DCD3C3" w:sz="4"/>
+              <w:bottom w:val="single" w:color="DDD9E5" w:sz="4"/>
               <w:right w:val="none" w:color="FFFFFF" w:sz="0"/>
             </w:tcBorders>
             <w:tcMar>
@@ -4296,7 +4296,7 @@
             <w:tcBorders>
               <w:top w:val="none" w:color="FFFFFF" w:sz="0"/>
               <w:left w:val="none" w:color="FFFFFF" w:sz="0"/>
-              <w:bottom w:val="single" w:color="DCD3C3" w:sz="4"/>
+              <w:bottom w:val="single" w:color="DDD9E5" w:sz="4"/>
               <w:right w:val="none" w:color="FFFFFF" w:sz="0"/>
             </w:tcBorders>
             <w:tcMar>
@@ -4322,7 +4322,7 @@
             <w:tcBorders>
               <w:top w:val="none" w:color="FFFFFF" w:sz="0"/>
               <w:left w:val="none" w:color="FFFFFF" w:sz="0"/>
-              <w:bottom w:val="single" w:color="DCD3C3" w:sz="4"/>
+              <w:bottom w:val="single" w:color="DDD9E5" w:sz="4"/>
               <w:right w:val="none" w:color="FFFFFF" w:sz="0"/>
             </w:tcBorders>
             <w:tcMar>
@@ -4348,7 +4348,7 @@
             <w:tcBorders>
               <w:top w:val="none" w:color="FFFFFF" w:sz="0"/>
               <w:left w:val="none" w:color="FFFFFF" w:sz="0"/>
-              <w:bottom w:val="single" w:color="DCD3C3" w:sz="4"/>
+              <w:bottom w:val="single" w:color="DDD9E5" w:sz="4"/>
               <w:right w:val="none" w:color="FFFFFF" w:sz="0"/>
             </w:tcBorders>
             <w:tcMar>
@@ -4375,7 +4375,7 @@
             <w:tcBorders>
               <w:top w:val="none" w:color="FFFFFF" w:sz="0"/>
               <w:left w:val="none" w:color="FFFFFF" w:sz="0"/>
-              <w:bottom w:val="single" w:color="DCD3C3" w:sz="4"/>
+              <w:bottom w:val="single" w:color="DDD9E5" w:sz="4"/>
               <w:right w:val="none" w:color="FFFFFF" w:sz="0"/>
             </w:tcBorders>
             <w:tcMar>
@@ -4401,7 +4401,7 @@
             <w:tcBorders>
               <w:top w:val="none" w:color="FFFFFF" w:sz="0"/>
               <w:left w:val="none" w:color="FFFFFF" w:sz="0"/>
-              <w:bottom w:val="single" w:color="DCD3C3" w:sz="4"/>
+              <w:bottom w:val="single" w:color="DDD9E5" w:sz="4"/>
               <w:right w:val="none" w:color="FFFFFF" w:sz="0"/>
             </w:tcBorders>
             <w:tcMar>
@@ -4435,7 +4435,7 @@
             <w:tcBorders>
               <w:top w:val="none" w:color="FFFFFF" w:sz="0"/>
               <w:left w:val="none" w:color="FFFFFF" w:sz="0"/>
-              <w:bottom w:val="single" w:color="DCD3C3" w:sz="4"/>
+              <w:bottom w:val="single" w:color="DDD9E5" w:sz="4"/>
               <w:right w:val="none" w:color="FFFFFF" w:sz="0"/>
             </w:tcBorders>
             <w:tcMar>
@@ -4472,7 +4472,7 @@
             <w:tcBorders>
               <w:top w:val="none" w:color="FFFFFF" w:sz="0"/>
               <w:left w:val="none" w:color="FFFFFF" w:sz="0"/>
-              <w:bottom w:val="single" w:color="DCD3C3" w:sz="4"/>
+              <w:bottom w:val="single" w:color="DDD9E5" w:sz="4"/>
               <w:right w:val="none" w:color="FFFFFF" w:sz="0"/>
             </w:tcBorders>
             <w:tcMar>
@@ -4498,7 +4498,7 @@
             <w:tcBorders>
               <w:top w:val="none" w:color="FFFFFF" w:sz="0"/>
               <w:left w:val="none" w:color="FFFFFF" w:sz="0"/>
-              <w:bottom w:val="single" w:color="DCD3C3" w:sz="4"/>
+              <w:bottom w:val="single" w:color="DDD9E5" w:sz="4"/>
               <w:right w:val="none" w:color="FFFFFF" w:sz="0"/>
             </w:tcBorders>
             <w:tcMar>
@@ -4524,7 +4524,7 @@
             <w:tcBorders>
               <w:top w:val="none" w:color="FFFFFF" w:sz="0"/>
               <w:left w:val="none" w:color="FFFFFF" w:sz="0"/>
-              <w:bottom w:val="single" w:color="DCD3C3" w:sz="4"/>
+              <w:bottom w:val="single" w:color="DDD9E5" w:sz="4"/>
               <w:right w:val="none" w:color="FFFFFF" w:sz="0"/>
             </w:tcBorders>
             <w:tcMar>
@@ -4551,7 +4551,7 @@
             <w:tcBorders>
               <w:top w:val="none" w:color="FFFFFF" w:sz="0"/>
               <w:left w:val="none" w:color="FFFFFF" w:sz="0"/>
-              <w:bottom w:val="single" w:color="DCD3C3" w:sz="4"/>
+              <w:bottom w:val="single" w:color="DDD9E5" w:sz="4"/>
               <w:right w:val="none" w:color="FFFFFF" w:sz="0"/>
             </w:tcBorders>
             <w:tcMar>
@@ -4577,7 +4577,7 @@
             <w:tcBorders>
               <w:top w:val="none" w:color="FFFFFF" w:sz="0"/>
               <w:left w:val="none" w:color="FFFFFF" w:sz="0"/>
-              <w:bottom w:val="single" w:color="DCD3C3" w:sz="4"/>
+              <w:bottom w:val="single" w:color="DDD9E5" w:sz="4"/>
               <w:right w:val="none" w:color="FFFFFF" w:sz="0"/>
             </w:tcBorders>
             <w:tcMar>
@@ -4627,7 +4627,7 @@
             <w:tcBorders>
               <w:top w:val="none" w:color="FFFFFF" w:sz="0"/>
               <w:left w:val="none" w:color="FFFFFF" w:sz="0"/>
-              <w:bottom w:val="single" w:color="DCD3C3" w:sz="4"/>
+              <w:bottom w:val="single" w:color="DDD9E5" w:sz="4"/>
               <w:right w:val="none" w:color="FFFFFF" w:sz="0"/>
             </w:tcBorders>
             <w:tcMar>
@@ -4931,10 +4931,10 @@
             <w:tcBorders>
               <w:top w:val="none" w:color="FFFFFF" w:sz="0"/>
               <w:left w:val="none" w:color="FFFFFF" w:sz="0"/>
-              <w:bottom w:val="single" w:color="DCD3C3" w:sz="4"/>
-              <w:right w:val="none" w:color="FFFFFF" w:sz="0"/>
-            </w:tcBorders>
-            <w:shd w:fill="F1ECE3" w:color="auto" w:val="clear"/>
+              <w:bottom w:val="single" w:color="DDD9E5" w:sz="4"/>
+              <w:right w:val="none" w:color="FFFFFF" w:sz="0"/>
+            </w:tcBorders>
+            <w:shd w:fill="F6F4F9" w:color="auto" w:val="clear"/>
             <w:tcMar>
               <w:top w:type="dxa" w:w="70"/>
               <w:left w:type="dxa" w:w="110"/>
@@ -4960,10 +4960,10 @@
             <w:tcBorders>
               <w:top w:val="none" w:color="FFFFFF" w:sz="0"/>
               <w:left w:val="none" w:color="FFFFFF" w:sz="0"/>
-              <w:bottom w:val="single" w:color="DCD3C3" w:sz="4"/>
-              <w:right w:val="none" w:color="FFFFFF" w:sz="0"/>
-            </w:tcBorders>
-            <w:shd w:fill="F1ECE3" w:color="auto" w:val="clear"/>
+              <w:bottom w:val="single" w:color="DDD9E5" w:sz="4"/>
+              <w:right w:val="none" w:color="FFFFFF" w:sz="0"/>
+            </w:tcBorders>
+            <w:shd w:fill="F6F4F9" w:color="auto" w:val="clear"/>
             <w:tcMar>
               <w:top w:type="dxa" w:w="70"/>
               <w:left w:type="dxa" w:w="110"/>
@@ -4989,10 +4989,10 @@
             <w:tcBorders>
               <w:top w:val="none" w:color="FFFFFF" w:sz="0"/>
               <w:left w:val="none" w:color="FFFFFF" w:sz="0"/>
-              <w:bottom w:val="single" w:color="DCD3C3" w:sz="4"/>
-              <w:right w:val="none" w:color="FFFFFF" w:sz="0"/>
-            </w:tcBorders>
-            <w:shd w:fill="F1ECE3" w:color="auto" w:val="clear"/>
+              <w:bottom w:val="single" w:color="DDD9E5" w:sz="4"/>
+              <w:right w:val="none" w:color="FFFFFF" w:sz="0"/>
+            </w:tcBorders>
+            <w:shd w:fill="F6F4F9" w:color="auto" w:val="clear"/>
             <w:tcMar>
               <w:top w:type="dxa" w:w="70"/>
               <w:left w:type="dxa" w:w="110"/>
@@ -5018,10 +5018,10 @@
             <w:tcBorders>
               <w:top w:val="none" w:color="FFFFFF" w:sz="0"/>
               <w:left w:val="none" w:color="FFFFFF" w:sz="0"/>
-              <w:bottom w:val="single" w:color="DCD3C3" w:sz="4"/>
-              <w:right w:val="none" w:color="FFFFFF" w:sz="0"/>
-            </w:tcBorders>
-            <w:shd w:fill="F1ECE3" w:color="auto" w:val="clear"/>
+              <w:bottom w:val="single" w:color="DDD9E5" w:sz="4"/>
+              <w:right w:val="none" w:color="FFFFFF" w:sz="0"/>
+            </w:tcBorders>
+            <w:shd w:fill="F6F4F9" w:color="auto" w:val="clear"/>
             <w:tcMar>
               <w:top w:type="dxa" w:w="70"/>
               <w:left w:type="dxa" w:w="110"/>
@@ -5049,7 +5049,7 @@
             <w:tcBorders>
               <w:top w:val="none" w:color="FFFFFF" w:sz="0"/>
               <w:left w:val="none" w:color="FFFFFF" w:sz="0"/>
-              <w:bottom w:val="single" w:color="DCD3C3" w:sz="4"/>
+              <w:bottom w:val="single" w:color="DDD9E5" w:sz="4"/>
               <w:right w:val="none" w:color="FFFFFF" w:sz="0"/>
             </w:tcBorders>
             <w:tcMar>
@@ -5075,7 +5075,7 @@
             <w:tcBorders>
               <w:top w:val="none" w:color="FFFFFF" w:sz="0"/>
               <w:left w:val="none" w:color="FFFFFF" w:sz="0"/>
-              <w:bottom w:val="single" w:color="DCD3C3" w:sz="4"/>
+              <w:bottom w:val="single" w:color="DDD9E5" w:sz="4"/>
               <w:right w:val="none" w:color="FFFFFF" w:sz="0"/>
             </w:tcBorders>
             <w:tcMar>
@@ -5110,7 +5110,7 @@
             <w:tcBorders>
               <w:top w:val="none" w:color="FFFFFF" w:sz="0"/>
               <w:left w:val="none" w:color="FFFFFF" w:sz="0"/>
-              <w:bottom w:val="single" w:color="DCD3C3" w:sz="4"/>
+              <w:bottom w:val="single" w:color="DDD9E5" w:sz="4"/>
               <w:right w:val="none" w:color="FFFFFF" w:sz="0"/>
             </w:tcBorders>
             <w:tcMar>
@@ -5136,7 +5136,7 @@
             <w:tcBorders>
               <w:top w:val="none" w:color="FFFFFF" w:sz="0"/>
               <w:left w:val="none" w:color="FFFFFF" w:sz="0"/>
-              <w:bottom w:val="single" w:color="DCD3C3" w:sz="4"/>
+              <w:bottom w:val="single" w:color="DDD9E5" w:sz="4"/>
               <w:right w:val="none" w:color="FFFFFF" w:sz="0"/>
             </w:tcBorders>
             <w:tcMar>
@@ -5172,7 +5172,7 @@
             <w:tcBorders>
               <w:top w:val="none" w:color="FFFFFF" w:sz="0"/>
               <w:left w:val="none" w:color="FFFFFF" w:sz="0"/>
-              <w:bottom w:val="single" w:color="DCD3C3" w:sz="4"/>
+              <w:bottom w:val="single" w:color="DDD9E5" w:sz="4"/>
               <w:right w:val="none" w:color="FFFFFF" w:sz="0"/>
             </w:tcBorders>
             <w:tcMar>
@@ -5198,7 +5198,7 @@
             <w:tcBorders>
               <w:top w:val="none" w:color="FFFFFF" w:sz="0"/>
               <w:left w:val="none" w:color="FFFFFF" w:sz="0"/>
-              <w:bottom w:val="single" w:color="DCD3C3" w:sz="4"/>
+              <w:bottom w:val="single" w:color="DDD9E5" w:sz="4"/>
               <w:right w:val="none" w:color="FFFFFF" w:sz="0"/>
             </w:tcBorders>
             <w:tcMar>
@@ -5233,7 +5233,7 @@
             <w:tcBorders>
               <w:top w:val="none" w:color="FFFFFF" w:sz="0"/>
               <w:left w:val="none" w:color="FFFFFF" w:sz="0"/>
-              <w:bottom w:val="single" w:color="DCD3C3" w:sz="4"/>
+              <w:bottom w:val="single" w:color="DDD9E5" w:sz="4"/>
               <w:right w:val="none" w:color="FFFFFF" w:sz="0"/>
             </w:tcBorders>
             <w:tcMar>
@@ -5260,7 +5260,7 @@
             <w:tcBorders>
               <w:top w:val="none" w:color="FFFFFF" w:sz="0"/>
               <w:left w:val="none" w:color="FFFFFF" w:sz="0"/>
-              <w:bottom w:val="single" w:color="DCD3C3" w:sz="4"/>
+              <w:bottom w:val="single" w:color="DDD9E5" w:sz="4"/>
               <w:right w:val="none" w:color="FFFFFF" w:sz="0"/>
             </w:tcBorders>
             <w:tcMar>
@@ -5289,7 +5289,7 @@
             <w:tcBorders>
               <w:top w:val="none" w:color="FFFFFF" w:sz="0"/>
               <w:left w:val="none" w:color="FFFFFF" w:sz="0"/>
-              <w:bottom w:val="single" w:color="DCD3C3" w:sz="4"/>
+              <w:bottom w:val="single" w:color="DDD9E5" w:sz="4"/>
               <w:right w:val="none" w:color="FFFFFF" w:sz="0"/>
             </w:tcBorders>
             <w:tcMar>
@@ -5315,7 +5315,7 @@
             <w:tcBorders>
               <w:top w:val="none" w:color="FFFFFF" w:sz="0"/>
               <w:left w:val="none" w:color="FFFFFF" w:sz="0"/>
-              <w:bottom w:val="single" w:color="DCD3C3" w:sz="4"/>
+              <w:bottom w:val="single" w:color="DDD9E5" w:sz="4"/>
               <w:right w:val="none" w:color="FFFFFF" w:sz="0"/>
             </w:tcBorders>
             <w:tcMar>
@@ -5343,7 +5343,7 @@
             <w:tcBorders>
               <w:top w:val="none" w:color="FFFFFF" w:sz="0"/>
               <w:left w:val="none" w:color="FFFFFF" w:sz="0"/>
-              <w:bottom w:val="single" w:color="DCD3C3" w:sz="4"/>
+              <w:bottom w:val="single" w:color="DDD9E5" w:sz="4"/>
               <w:right w:val="none" w:color="FFFFFF" w:sz="0"/>
             </w:tcBorders>
             <w:tcMar>
@@ -5370,7 +5370,7 @@
             <w:tcBorders>
               <w:top w:val="none" w:color="FFFFFF" w:sz="0"/>
               <w:left w:val="none" w:color="FFFFFF" w:sz="0"/>
-              <w:bottom w:val="single" w:color="DCD3C3" w:sz="4"/>
+              <w:bottom w:val="single" w:color="DDD9E5" w:sz="4"/>
               <w:right w:val="none" w:color="FFFFFF" w:sz="0"/>
             </w:tcBorders>
             <w:tcMar>
@@ -5399,7 +5399,7 @@
             <w:tcBorders>
               <w:top w:val="none" w:color="FFFFFF" w:sz="0"/>
               <w:left w:val="none" w:color="FFFFFF" w:sz="0"/>
-              <w:bottom w:val="single" w:color="DCD3C3" w:sz="4"/>
+              <w:bottom w:val="single" w:color="DDD9E5" w:sz="4"/>
               <w:right w:val="none" w:color="FFFFFF" w:sz="0"/>
             </w:tcBorders>
             <w:tcMar>
@@ -5425,7 +5425,7 @@
             <w:tcBorders>
               <w:top w:val="none" w:color="FFFFFF" w:sz="0"/>
               <w:left w:val="none" w:color="FFFFFF" w:sz="0"/>
-              <w:bottom w:val="single" w:color="DCD3C3" w:sz="4"/>
+              <w:bottom w:val="single" w:color="DDD9E5" w:sz="4"/>
               <w:right w:val="none" w:color="FFFFFF" w:sz="0"/>
             </w:tcBorders>
             <w:tcMar>
@@ -5469,7 +5469,7 @@
             <w:tcBorders>
               <w:top w:val="none" w:color="FFFFFF" w:sz="0"/>
               <w:left w:val="none" w:color="FFFFFF" w:sz="0"/>
-              <w:bottom w:val="single" w:color="DCD3C3" w:sz="4"/>
+              <w:bottom w:val="single" w:color="DDD9E5" w:sz="4"/>
               <w:right w:val="none" w:color="FFFFFF" w:sz="0"/>
             </w:tcBorders>
             <w:tcMar>
@@ -5496,7 +5496,7 @@
             <w:tcBorders>
               <w:top w:val="none" w:color="FFFFFF" w:sz="0"/>
               <w:left w:val="none" w:color="FFFFFF" w:sz="0"/>
-              <w:bottom w:val="single" w:color="DCD3C3" w:sz="4"/>
+              <w:bottom w:val="single" w:color="DDD9E5" w:sz="4"/>
               <w:right w:val="none" w:color="FFFFFF" w:sz="0"/>
             </w:tcBorders>
             <w:tcMar>
@@ -5525,7 +5525,7 @@
             <w:tcBorders>
               <w:top w:val="none" w:color="FFFFFF" w:sz="0"/>
               <w:left w:val="none" w:color="FFFFFF" w:sz="0"/>
-              <w:bottom w:val="single" w:color="DCD3C3" w:sz="4"/>
+              <w:bottom w:val="single" w:color="DDD9E5" w:sz="4"/>
               <w:right w:val="none" w:color="FFFFFF" w:sz="0"/>
             </w:tcBorders>
             <w:tcMar>
@@ -5551,7 +5551,7 @@
             <w:tcBorders>
               <w:top w:val="none" w:color="FFFFFF" w:sz="0"/>
               <w:left w:val="none" w:color="FFFFFF" w:sz="0"/>
-              <w:bottom w:val="single" w:color="DCD3C3" w:sz="4"/>
+              <w:bottom w:val="single" w:color="DDD9E5" w:sz="4"/>
               <w:right w:val="none" w:color="FFFFFF" w:sz="0"/>
             </w:tcBorders>
             <w:tcMar>
@@ -5586,7 +5586,7 @@
             <w:tcBorders>
               <w:top w:val="none" w:color="FFFFFF" w:sz="0"/>
               <w:left w:val="none" w:color="FFFFFF" w:sz="0"/>
-              <w:bottom w:val="single" w:color="DCD3C3" w:sz="4"/>
+              <w:bottom w:val="single" w:color="DDD9E5" w:sz="4"/>
               <w:right w:val="none" w:color="FFFFFF" w:sz="0"/>
             </w:tcBorders>
             <w:tcMar>
@@ -5612,7 +5612,7 @@
             <w:tcBorders>
               <w:top w:val="none" w:color="FFFFFF" w:sz="0"/>
               <w:left w:val="none" w:color="FFFFFF" w:sz="0"/>
-              <w:bottom w:val="single" w:color="DCD3C3" w:sz="4"/>
+              <w:bottom w:val="single" w:color="DDD9E5" w:sz="4"/>
               <w:right w:val="none" w:color="FFFFFF" w:sz="0"/>
             </w:tcBorders>
             <w:tcMar>
@@ -5697,7 +5697,7 @@
               <w:bottom w:val="none" w:color="FFFFFF" w:sz="0"/>
               <w:right w:val="none" w:color="FFFFFF" w:sz="0"/>
             </w:tcBorders>
-            <w:shd w:fill="FAEDDC" w:color="auto" w:val="clear"/>
+            <w:shd w:fill="EFE7FF" w:color="auto" w:val="clear"/>
             <w:tcMar>
               <w:top w:type="dxa" w:w="70"/>
               <w:left w:type="dxa" w:w="110"/>
@@ -5714,7 +5714,7 @@
                 <w:rFonts w:ascii="Arial" w:cs="Arial" w:eastAsia="Arial" w:hAnsi="Arial"/>
                 <w:b/>
                 <w:bCs/>
-                <w:color w:val="D98324"/>
+                <w:color w:val="6D3FD1"/>
                 <w:spacing w:val="20"/>
                 <w:sz w:val="15"/>
                 <w:szCs w:val="15"/>
@@ -5812,7 +5812,7 @@
           <w:rFonts w:ascii="Arial" w:cs="Arial" w:eastAsia="Arial" w:hAnsi="Arial"/>
           <w:b/>
           <w:bCs/>
-          <w:color w:val="7C766B"/>
+          <w:color w:val="6C6873"/>
           <w:spacing w:val="20"/>
           <w:sz w:val="15"/>
           <w:szCs w:val="15"/>
@@ -5861,7 +5861,7 @@
             <w:tcBorders>
               <w:top w:val="none" w:color="FFFFFF" w:sz="0"/>
               <w:left w:val="none" w:color="FFFFFF" w:sz="0"/>
-              <w:bottom w:val="single" w:color="DCD3C3" w:sz="4"/>
+              <w:bottom w:val="single" w:color="DDD9E5" w:sz="4"/>
               <w:right w:val="none" w:color="FFFFFF" w:sz="0"/>
             </w:tcBorders>
             <w:tcMar>
@@ -5889,7 +5889,7 @@
             <w:tcBorders>
               <w:top w:val="none" w:color="FFFFFF" w:sz="0"/>
               <w:left w:val="none" w:color="FFFFFF" w:sz="0"/>
-              <w:bottom w:val="single" w:color="DCD3C3" w:sz="4"/>
+              <w:bottom w:val="single" w:color="DDD9E5" w:sz="4"/>
               <w:right w:val="none" w:color="FFFFFF" w:sz="0"/>
             </w:tcBorders>
             <w:tcMar>
@@ -5918,7 +5918,7 @@
             <w:tcBorders>
               <w:top w:val="none" w:color="FFFFFF" w:sz="0"/>
               <w:left w:val="none" w:color="FFFFFF" w:sz="0"/>
-              <w:bottom w:val="single" w:color="DCD3C3" w:sz="4"/>
+              <w:bottom w:val="single" w:color="DDD9E5" w:sz="4"/>
               <w:right w:val="none" w:color="FFFFFF" w:sz="0"/>
             </w:tcBorders>
             <w:tcMar>
@@ -5946,7 +5946,7 @@
             <w:tcBorders>
               <w:top w:val="none" w:color="FFFFFF" w:sz="0"/>
               <w:left w:val="none" w:color="FFFFFF" w:sz="0"/>
-              <w:bottom w:val="single" w:color="DCD3C3" w:sz="4"/>
+              <w:bottom w:val="single" w:color="DDD9E5" w:sz="4"/>
               <w:right w:val="none" w:color="FFFFFF" w:sz="0"/>
             </w:tcBorders>
             <w:tcMar>
@@ -5974,7 +5974,7 @@
             <w:tcBorders>
               <w:top w:val="none" w:color="FFFFFF" w:sz="0"/>
               <w:left w:val="none" w:color="FFFFFF" w:sz="0"/>
-              <w:bottom w:val="single" w:color="DCD3C3" w:sz="4"/>
+              <w:bottom w:val="single" w:color="DDD9E5" w:sz="4"/>
               <w:right w:val="none" w:color="FFFFFF" w:sz="0"/>
             </w:tcBorders>
             <w:tcMar>
@@ -6002,7 +6002,7 @@
             <w:tcBorders>
               <w:top w:val="none" w:color="FFFFFF" w:sz="0"/>
               <w:left w:val="none" w:color="FFFFFF" w:sz="0"/>
-              <w:bottom w:val="single" w:color="DCD3C3" w:sz="4"/>
+              <w:bottom w:val="single" w:color="DDD9E5" w:sz="4"/>
               <w:right w:val="none" w:color="FFFFFF" w:sz="0"/>
             </w:tcBorders>
             <w:tcMar>
@@ -6099,7 +6099,7 @@
             <w:tcBorders>
               <w:top w:val="none" w:color="FFFFFF" w:sz="0"/>
               <w:left w:val="none" w:color="FFFFFF" w:sz="0"/>
-              <w:bottom w:val="single" w:color="DCD3C3" w:sz="4"/>
+              <w:bottom w:val="single" w:color="DDD9E5" w:sz="4"/>
               <w:right w:val="none" w:color="FFFFFF" w:sz="0"/>
             </w:tcBorders>
             <w:tcMar>
@@ -6127,7 +6127,7 @@
             <w:tcBorders>
               <w:top w:val="none" w:color="FFFFFF" w:sz="0"/>
               <w:left w:val="none" w:color="FFFFFF" w:sz="0"/>
-              <w:bottom w:val="single" w:color="DCD3C3" w:sz="4"/>
+              <w:bottom w:val="single" w:color="DDD9E5" w:sz="4"/>
               <w:right w:val="none" w:color="FFFFFF" w:sz="0"/>
             </w:tcBorders>
             <w:tcMar>
@@ -6208,7 +6208,7 @@
             <w:tcBorders>
               <w:top w:val="none" w:color="FFFFFF" w:sz="0"/>
               <w:left w:val="none" w:color="FFFFFF" w:sz="0"/>
-              <w:bottom w:val="single" w:color="DCD3C3" w:sz="4"/>
+              <w:bottom w:val="single" w:color="DDD9E5" w:sz="4"/>
               <w:right w:val="none" w:color="FFFFFF" w:sz="0"/>
             </w:tcBorders>
             <w:tcMar>
@@ -6236,7 +6236,7 @@
             <w:tcBorders>
               <w:top w:val="none" w:color="FFFFFF" w:sz="0"/>
               <w:left w:val="none" w:color="FFFFFF" w:sz="0"/>
-              <w:bottom w:val="single" w:color="DCD3C3" w:sz="4"/>
+              <w:bottom w:val="single" w:color="DDD9E5" w:sz="4"/>
               <w:right w:val="none" w:color="FFFFFF" w:sz="0"/>
             </w:tcBorders>
             <w:tcMar>
@@ -6341,7 +6341,7 @@
             <w:tcBorders>
               <w:top w:val="none" w:color="FFFFFF" w:sz="0"/>
               <w:left w:val="none" w:color="FFFFFF" w:sz="0"/>
-              <w:bottom w:val="single" w:color="DCD3C3" w:sz="4"/>
+              <w:bottom w:val="single" w:color="DDD9E5" w:sz="4"/>
               <w:right w:val="none" w:color="FFFFFF" w:sz="0"/>
             </w:tcBorders>
             <w:tcMar>
@@ -6369,7 +6369,7 @@
             <w:tcBorders>
               <w:top w:val="none" w:color="FFFFFF" w:sz="0"/>
               <w:left w:val="none" w:color="FFFFFF" w:sz="0"/>
-              <w:bottom w:val="single" w:color="DCD3C3" w:sz="4"/>
+              <w:bottom w:val="single" w:color="DDD9E5" w:sz="4"/>
               <w:right w:val="none" w:color="FFFFFF" w:sz="0"/>
             </w:tcBorders>
             <w:tcMar>
@@ -6397,7 +6397,7 @@
             <w:tcBorders>
               <w:top w:val="none" w:color="FFFFFF" w:sz="0"/>
               <w:left w:val="none" w:color="FFFFFF" w:sz="0"/>
-              <w:bottom w:val="single" w:color="DCD3C3" w:sz="4"/>
+              <w:bottom w:val="single" w:color="DDD9E5" w:sz="4"/>
               <w:right w:val="none" w:color="FFFFFF" w:sz="0"/>
             </w:tcBorders>
             <w:tcMar>
@@ -6425,7 +6425,7 @@
             <w:tcBorders>
               <w:top w:val="none" w:color="FFFFFF" w:sz="0"/>
               <w:left w:val="none" w:color="FFFFFF" w:sz="0"/>
-              <w:bottom w:val="single" w:color="DCD3C3" w:sz="4"/>
+              <w:bottom w:val="single" w:color="DDD9E5" w:sz="4"/>
               <w:right w:val="none" w:color="FFFFFF" w:sz="0"/>
             </w:tcBorders>
             <w:tcMar>
@@ -6468,7 +6468,7 @@
             <w:tcBorders>
               <w:top w:val="none" w:color="FFFFFF" w:sz="0"/>
               <w:left w:val="none" w:color="FFFFFF" w:sz="0"/>
-              <w:bottom w:val="single" w:color="DCD3C3" w:sz="4"/>
+              <w:bottom w:val="single" w:color="DDD9E5" w:sz="4"/>
               <w:right w:val="none" w:color="FFFFFF" w:sz="0"/>
             </w:tcBorders>
             <w:tcMar>
@@ -6496,7 +6496,7 @@
             <w:tcBorders>
               <w:top w:val="none" w:color="FFFFFF" w:sz="0"/>
               <w:left w:val="none" w:color="FFFFFF" w:sz="0"/>
-              <w:bottom w:val="single" w:color="DCD3C3" w:sz="4"/>
+              <w:bottom w:val="single" w:color="DDD9E5" w:sz="4"/>
               <w:right w:val="none" w:color="FFFFFF" w:sz="0"/>
             </w:tcBorders>
             <w:tcMar>
@@ -6539,7 +6539,7 @@
             <w:tcBorders>
               <w:top w:val="none" w:color="FFFFFF" w:sz="0"/>
               <w:left w:val="none" w:color="FFFFFF" w:sz="0"/>
-              <w:bottom w:val="single" w:color="DCD3C3" w:sz="4"/>
+              <w:bottom w:val="single" w:color="DDD9E5" w:sz="4"/>
               <w:right w:val="none" w:color="FFFFFF" w:sz="0"/>
             </w:tcBorders>
             <w:tcMar>
@@ -6567,7 +6567,7 @@
             <w:tcBorders>
               <w:top w:val="none" w:color="FFFFFF" w:sz="0"/>
               <w:left w:val="none" w:color="FFFFFF" w:sz="0"/>
-              <w:bottom w:val="single" w:color="DCD3C3" w:sz="4"/>
+              <w:bottom w:val="single" w:color="DDD9E5" w:sz="4"/>
               <w:right w:val="none" w:color="FFFFFF" w:sz="0"/>
             </w:tcBorders>
             <w:tcMar>
@@ -6696,10 +6696,10 @@
             <w:tcBorders>
               <w:top w:val="none" w:color="FFFFFF" w:sz="0"/>
               <w:left w:val="none" w:color="FFFFFF" w:sz="0"/>
-              <w:bottom w:val="single" w:color="DCD3C3" w:sz="4"/>
-              <w:right w:val="none" w:color="FFFFFF" w:sz="0"/>
-            </w:tcBorders>
-            <w:shd w:fill="F1ECE3" w:color="auto" w:val="clear"/>
+              <w:bottom w:val="single" w:color="DDD9E5" w:sz="4"/>
+              <w:right w:val="none" w:color="FFFFFF" w:sz="0"/>
+            </w:tcBorders>
+            <w:shd w:fill="F6F4F9" w:color="auto" w:val="clear"/>
             <w:tcMar>
               <w:top w:type="dxa" w:w="70"/>
               <w:left w:type="dxa" w:w="110"/>
@@ -6725,10 +6725,10 @@
             <w:tcBorders>
               <w:top w:val="none" w:color="FFFFFF" w:sz="0"/>
               <w:left w:val="none" w:color="FFFFFF" w:sz="0"/>
-              <w:bottom w:val="single" w:color="DCD3C3" w:sz="4"/>
-              <w:right w:val="none" w:color="FFFFFF" w:sz="0"/>
-            </w:tcBorders>
-            <w:shd w:fill="F1ECE3" w:color="auto" w:val="clear"/>
+              <w:bottom w:val="single" w:color="DDD9E5" w:sz="4"/>
+              <w:right w:val="none" w:color="FFFFFF" w:sz="0"/>
+            </w:tcBorders>
+            <w:shd w:fill="F6F4F9" w:color="auto" w:val="clear"/>
             <w:tcMar>
               <w:top w:type="dxa" w:w="70"/>
               <w:left w:type="dxa" w:w="110"/>
@@ -6754,10 +6754,10 @@
             <w:tcBorders>
               <w:top w:val="none" w:color="FFFFFF" w:sz="0"/>
               <w:left w:val="none" w:color="FFFFFF" w:sz="0"/>
-              <w:bottom w:val="single" w:color="DCD3C3" w:sz="4"/>
-              <w:right w:val="none" w:color="FFFFFF" w:sz="0"/>
-            </w:tcBorders>
-            <w:shd w:fill="F1ECE3" w:color="auto" w:val="clear"/>
+              <w:bottom w:val="single" w:color="DDD9E5" w:sz="4"/>
+              <w:right w:val="none" w:color="FFFFFF" w:sz="0"/>
+            </w:tcBorders>
+            <w:shd w:fill="F6F4F9" w:color="auto" w:val="clear"/>
             <w:tcMar>
               <w:top w:type="dxa" w:w="70"/>
               <w:left w:type="dxa" w:w="110"/>
@@ -6785,7 +6785,7 @@
             <w:tcBorders>
               <w:top w:val="none" w:color="FFFFFF" w:sz="0"/>
               <w:left w:val="none" w:color="FFFFFF" w:sz="0"/>
-              <w:bottom w:val="single" w:color="DCD3C3" w:sz="4"/>
+              <w:bottom w:val="single" w:color="DDD9E5" w:sz="4"/>
               <w:right w:val="none" w:color="FFFFFF" w:sz="0"/>
             </w:tcBorders>
             <w:tcMar>
@@ -6820,7 +6820,7 @@
             <w:tcBorders>
               <w:top w:val="none" w:color="FFFFFF" w:sz="0"/>
               <w:left w:val="none" w:color="FFFFFF" w:sz="0"/>
-              <w:bottom w:val="single" w:color="DCD3C3" w:sz="4"/>
+              <w:bottom w:val="single" w:color="DDD9E5" w:sz="4"/>
               <w:right w:val="none" w:color="FFFFFF" w:sz="0"/>
             </w:tcBorders>
             <w:tcMar>
@@ -6846,7 +6846,7 @@
             <w:tcBorders>
               <w:top w:val="none" w:color="FFFFFF" w:sz="0"/>
               <w:left w:val="none" w:color="FFFFFF" w:sz="0"/>
-              <w:bottom w:val="single" w:color="DCD3C3" w:sz="4"/>
+              <w:bottom w:val="single" w:color="DDD9E5" w:sz="4"/>
               <w:right w:val="none" w:color="FFFFFF" w:sz="0"/>
             </w:tcBorders>
             <w:tcMar>
@@ -6875,7 +6875,7 @@
             <w:tcBorders>
               <w:top w:val="none" w:color="FFFFFF" w:sz="0"/>
               <w:left w:val="none" w:color="FFFFFF" w:sz="0"/>
-              <w:bottom w:val="single" w:color="DCD3C3" w:sz="4"/>
+              <w:bottom w:val="single" w:color="DDD9E5" w:sz="4"/>
               <w:right w:val="none" w:color="FFFFFF" w:sz="0"/>
             </w:tcBorders>
             <w:tcMar>
@@ -6910,7 +6910,7 @@
             <w:tcBorders>
               <w:top w:val="none" w:color="FFFFFF" w:sz="0"/>
               <w:left w:val="none" w:color="FFFFFF" w:sz="0"/>
-              <w:bottom w:val="single" w:color="DCD3C3" w:sz="4"/>
+              <w:bottom w:val="single" w:color="DDD9E5" w:sz="4"/>
               <w:right w:val="none" w:color="FFFFFF" w:sz="0"/>
             </w:tcBorders>
             <w:tcMar>
@@ -6936,7 +6936,7 @@
             <w:tcBorders>
               <w:top w:val="none" w:color="FFFFFF" w:sz="0"/>
               <w:left w:val="none" w:color="FFFFFF" w:sz="0"/>
-              <w:bottom w:val="single" w:color="DCD3C3" w:sz="4"/>
+              <w:bottom w:val="single" w:color="DDD9E5" w:sz="4"/>
               <w:right w:val="none" w:color="FFFFFF" w:sz="0"/>
             </w:tcBorders>
             <w:tcMar>
@@ -6965,7 +6965,7 @@
             <w:tcBorders>
               <w:top w:val="none" w:color="FFFFFF" w:sz="0"/>
               <w:left w:val="none" w:color="FFFFFF" w:sz="0"/>
-              <w:bottom w:val="single" w:color="DCD3C3" w:sz="4"/>
+              <w:bottom w:val="single" w:color="DDD9E5" w:sz="4"/>
               <w:right w:val="none" w:color="FFFFFF" w:sz="0"/>
             </w:tcBorders>
             <w:tcMar>
@@ -7000,7 +7000,7 @@
             <w:tcBorders>
               <w:top w:val="none" w:color="FFFFFF" w:sz="0"/>
               <w:left w:val="none" w:color="FFFFFF" w:sz="0"/>
-              <w:bottom w:val="single" w:color="DCD3C3" w:sz="4"/>
+              <w:bottom w:val="single" w:color="DDD9E5" w:sz="4"/>
               <w:right w:val="none" w:color="FFFFFF" w:sz="0"/>
             </w:tcBorders>
             <w:tcMar>
@@ -7026,7 +7026,7 @@
             <w:tcBorders>
               <w:top w:val="none" w:color="FFFFFF" w:sz="0"/>
               <w:left w:val="none" w:color="FFFFFF" w:sz="0"/>
-              <w:bottom w:val="single" w:color="DCD3C3" w:sz="4"/>
+              <w:bottom w:val="single" w:color="DDD9E5" w:sz="4"/>
               <w:right w:val="none" w:color="FFFFFF" w:sz="0"/>
             </w:tcBorders>
             <w:tcMar>
@@ -7408,10 +7408,10 @@
             <w:tcBorders>
               <w:top w:val="none" w:color="FFFFFF" w:sz="0"/>
               <w:left w:val="none" w:color="FFFFFF" w:sz="0"/>
-              <w:bottom w:val="single" w:color="DCD3C3" w:sz="4"/>
-              <w:right w:val="none" w:color="FFFFFF" w:sz="0"/>
-            </w:tcBorders>
-            <w:shd w:fill="F1ECE3" w:color="auto" w:val="clear"/>
+              <w:bottom w:val="single" w:color="DDD9E5" w:sz="4"/>
+              <w:right w:val="none" w:color="FFFFFF" w:sz="0"/>
+            </w:tcBorders>
+            <w:shd w:fill="F6F4F9" w:color="auto" w:val="clear"/>
             <w:tcMar>
               <w:top w:type="dxa" w:w="70"/>
               <w:left w:type="dxa" w:w="110"/>
@@ -7437,10 +7437,10 @@
             <w:tcBorders>
               <w:top w:val="none" w:color="FFFFFF" w:sz="0"/>
               <w:left w:val="none" w:color="FFFFFF" w:sz="0"/>
-              <w:bottom w:val="single" w:color="DCD3C3" w:sz="4"/>
-              <w:right w:val="none" w:color="FFFFFF" w:sz="0"/>
-            </w:tcBorders>
-            <w:shd w:fill="F1ECE3" w:color="auto" w:val="clear"/>
+              <w:bottom w:val="single" w:color="DDD9E5" w:sz="4"/>
+              <w:right w:val="none" w:color="FFFFFF" w:sz="0"/>
+            </w:tcBorders>
+            <w:shd w:fill="F6F4F9" w:color="auto" w:val="clear"/>
             <w:tcMar>
               <w:top w:type="dxa" w:w="70"/>
               <w:left w:type="dxa" w:w="110"/>
@@ -7466,10 +7466,10 @@
             <w:tcBorders>
               <w:top w:val="none" w:color="FFFFFF" w:sz="0"/>
               <w:left w:val="none" w:color="FFFFFF" w:sz="0"/>
-              <w:bottom w:val="single" w:color="DCD3C3" w:sz="4"/>
-              <w:right w:val="none" w:color="FFFFFF" w:sz="0"/>
-            </w:tcBorders>
-            <w:shd w:fill="F1ECE3" w:color="auto" w:val="clear"/>
+              <w:bottom w:val="single" w:color="DDD9E5" w:sz="4"/>
+              <w:right w:val="none" w:color="FFFFFF" w:sz="0"/>
+            </w:tcBorders>
+            <w:shd w:fill="F6F4F9" w:color="auto" w:val="clear"/>
             <w:tcMar>
               <w:top w:type="dxa" w:w="70"/>
               <w:left w:type="dxa" w:w="110"/>
@@ -7495,10 +7495,10 @@
             <w:tcBorders>
               <w:top w:val="none" w:color="FFFFFF" w:sz="0"/>
               <w:left w:val="none" w:color="FFFFFF" w:sz="0"/>
-              <w:bottom w:val="single" w:color="DCD3C3" w:sz="4"/>
-              <w:right w:val="none" w:color="FFFFFF" w:sz="0"/>
-            </w:tcBorders>
-            <w:shd w:fill="F1ECE3" w:color="auto" w:val="clear"/>
+              <w:bottom w:val="single" w:color="DDD9E5" w:sz="4"/>
+              <w:right w:val="none" w:color="FFFFFF" w:sz="0"/>
+            </w:tcBorders>
+            <w:shd w:fill="F6F4F9" w:color="auto" w:val="clear"/>
             <w:tcMar>
               <w:top w:type="dxa" w:w="70"/>
               <w:left w:type="dxa" w:w="110"/>
@@ -7545,7 +7545,7 @@
             <w:tcBorders>
               <w:top w:val="none" w:color="FFFFFF" w:sz="0"/>
               <w:left w:val="none" w:color="FFFFFF" w:sz="0"/>
-              <w:bottom w:val="single" w:color="DCD3C3" w:sz="4"/>
+              <w:bottom w:val="single" w:color="DDD9E5" w:sz="4"/>
               <w:right w:val="none" w:color="FFFFFF" w:sz="0"/>
             </w:tcBorders>
             <w:tcMar>
@@ -7573,7 +7573,7 @@
             <w:tcBorders>
               <w:top w:val="none" w:color="FFFFFF" w:sz="0"/>
               <w:left w:val="none" w:color="FFFFFF" w:sz="0"/>
-              <w:bottom w:val="single" w:color="DCD3C3" w:sz="4"/>
+              <w:bottom w:val="single" w:color="DDD9E5" w:sz="4"/>
               <w:right w:val="none" w:color="FFFFFF" w:sz="0"/>
             </w:tcBorders>
             <w:tcMar>
@@ -7599,7 +7599,7 @@
             <w:tcBorders>
               <w:top w:val="none" w:color="FFFFFF" w:sz="0"/>
               <w:left w:val="none" w:color="FFFFFF" w:sz="0"/>
-              <w:bottom w:val="single" w:color="DCD3C3" w:sz="4"/>
+              <w:bottom w:val="single" w:color="DDD9E5" w:sz="4"/>
               <w:right w:val="none" w:color="FFFFFF" w:sz="0"/>
             </w:tcBorders>
             <w:tcMar>
@@ -7634,7 +7634,7 @@
             <w:tcBorders>
               <w:top w:val="none" w:color="FFFFFF" w:sz="0"/>
               <w:left w:val="none" w:color="FFFFFF" w:sz="0"/>
-              <w:bottom w:val="single" w:color="DCD3C3" w:sz="4"/>
+              <w:bottom w:val="single" w:color="DDD9E5" w:sz="4"/>
               <w:right w:val="none" w:color="FFFFFF" w:sz="0"/>
             </w:tcBorders>
             <w:tcMar>
@@ -7664,7 +7664,7 @@
             <w:tcBorders>
               <w:top w:val="none" w:color="FFFFFF" w:sz="0"/>
               <w:left w:val="none" w:color="FFFFFF" w:sz="0"/>
-              <w:bottom w:val="single" w:color="DCD3C3" w:sz="4"/>
+              <w:bottom w:val="single" w:color="DDD9E5" w:sz="4"/>
               <w:right w:val="none" w:color="FFFFFF" w:sz="0"/>
             </w:tcBorders>
             <w:tcMar>
@@ -7692,7 +7692,7 @@
             <w:tcBorders>
               <w:top w:val="none" w:color="FFFFFF" w:sz="0"/>
               <w:left w:val="none" w:color="FFFFFF" w:sz="0"/>
-              <w:bottom w:val="single" w:color="DCD3C3" w:sz="4"/>
+              <w:bottom w:val="single" w:color="DDD9E5" w:sz="4"/>
               <w:right w:val="none" w:color="FFFFFF" w:sz="0"/>
             </w:tcBorders>
             <w:tcMar>
@@ -7718,7 +7718,7 @@
             <w:tcBorders>
               <w:top w:val="none" w:color="FFFFFF" w:sz="0"/>
               <w:left w:val="none" w:color="FFFFFF" w:sz="0"/>
-              <w:bottom w:val="single" w:color="DCD3C3" w:sz="4"/>
+              <w:bottom w:val="single" w:color="DDD9E5" w:sz="4"/>
               <w:right w:val="none" w:color="FFFFFF" w:sz="0"/>
             </w:tcBorders>
             <w:tcMar>
@@ -7744,7 +7744,7 @@
             <w:tcBorders>
               <w:top w:val="none" w:color="FFFFFF" w:sz="0"/>
               <w:left w:val="none" w:color="FFFFFF" w:sz="0"/>
-              <w:bottom w:val="single" w:color="DCD3C3" w:sz="4"/>
+              <w:bottom w:val="single" w:color="DDD9E5" w:sz="4"/>
               <w:right w:val="none" w:color="FFFFFF" w:sz="0"/>
             </w:tcBorders>
             <w:tcMar>
@@ -7772,7 +7772,7 @@
             <w:tcBorders>
               <w:top w:val="none" w:color="FFFFFF" w:sz="0"/>
               <w:left w:val="none" w:color="FFFFFF" w:sz="0"/>
-              <w:bottom w:val="single" w:color="DCD3C3" w:sz="4"/>
+              <w:bottom w:val="single" w:color="DDD9E5" w:sz="4"/>
               <w:right w:val="none" w:color="FFFFFF" w:sz="0"/>
             </w:tcBorders>
             <w:tcMar>
@@ -7800,7 +7800,7 @@
             <w:tcBorders>
               <w:top w:val="none" w:color="FFFFFF" w:sz="0"/>
               <w:left w:val="none" w:color="FFFFFF" w:sz="0"/>
-              <w:bottom w:val="single" w:color="DCD3C3" w:sz="4"/>
+              <w:bottom w:val="single" w:color="DDD9E5" w:sz="4"/>
               <w:right w:val="none" w:color="FFFFFF" w:sz="0"/>
             </w:tcBorders>
             <w:tcMar>
@@ -7826,7 +7826,7 @@
             <w:tcBorders>
               <w:top w:val="none" w:color="FFFFFF" w:sz="0"/>
               <w:left w:val="none" w:color="FFFFFF" w:sz="0"/>
-              <w:bottom w:val="single" w:color="DCD3C3" w:sz="4"/>
+              <w:bottom w:val="single" w:color="DDD9E5" w:sz="4"/>
               <w:right w:val="none" w:color="FFFFFF" w:sz="0"/>
             </w:tcBorders>
             <w:tcMar>
@@ -7852,7 +7852,7 @@
             <w:tcBorders>
               <w:top w:val="none" w:color="FFFFFF" w:sz="0"/>
               <w:left w:val="none" w:color="FFFFFF" w:sz="0"/>
-              <w:bottom w:val="single" w:color="DCD3C3" w:sz="4"/>
+              <w:bottom w:val="single" w:color="DDD9E5" w:sz="4"/>
               <w:right w:val="none" w:color="FFFFFF" w:sz="0"/>
             </w:tcBorders>
             <w:tcMar>
@@ -7880,7 +7880,7 @@
             <w:tcBorders>
               <w:top w:val="none" w:color="FFFFFF" w:sz="0"/>
               <w:left w:val="none" w:color="FFFFFF" w:sz="0"/>
-              <w:bottom w:val="single" w:color="DCD3C3" w:sz="4"/>
+              <w:bottom w:val="single" w:color="DDD9E5" w:sz="4"/>
               <w:right w:val="none" w:color="FFFFFF" w:sz="0"/>
             </w:tcBorders>
             <w:tcMar>
@@ -7908,7 +7908,7 @@
             <w:tcBorders>
               <w:top w:val="none" w:color="FFFFFF" w:sz="0"/>
               <w:left w:val="none" w:color="FFFFFF" w:sz="0"/>
-              <w:bottom w:val="single" w:color="DCD3C3" w:sz="4"/>
+              <w:bottom w:val="single" w:color="DDD9E5" w:sz="4"/>
               <w:right w:val="none" w:color="FFFFFF" w:sz="0"/>
             </w:tcBorders>
             <w:tcMar>
@@ -7934,7 +7934,7 @@
             <w:tcBorders>
               <w:top w:val="none" w:color="FFFFFF" w:sz="0"/>
               <w:left w:val="none" w:color="FFFFFF" w:sz="0"/>
-              <w:bottom w:val="single" w:color="DCD3C3" w:sz="4"/>
+              <w:bottom w:val="single" w:color="DDD9E5" w:sz="4"/>
               <w:right w:val="none" w:color="FFFFFF" w:sz="0"/>
             </w:tcBorders>
             <w:tcMar>
@@ -7960,7 +7960,7 @@
             <w:tcBorders>
               <w:top w:val="none" w:color="FFFFFF" w:sz="0"/>
               <w:left w:val="none" w:color="FFFFFF" w:sz="0"/>
-              <w:bottom w:val="single" w:color="DCD3C3" w:sz="4"/>
+              <w:bottom w:val="single" w:color="DDD9E5" w:sz="4"/>
               <w:right w:val="none" w:color="FFFFFF" w:sz="0"/>
             </w:tcBorders>
             <w:tcMar>
@@ -7988,7 +7988,7 @@
             <w:tcBorders>
               <w:top w:val="none" w:color="FFFFFF" w:sz="0"/>
               <w:left w:val="none" w:color="FFFFFF" w:sz="0"/>
-              <w:bottom w:val="single" w:color="DCD3C3" w:sz="4"/>
+              <w:bottom w:val="single" w:color="DDD9E5" w:sz="4"/>
               <w:right w:val="none" w:color="FFFFFF" w:sz="0"/>
             </w:tcBorders>
             <w:tcMar>
@@ -8016,7 +8016,7 @@
             <w:tcBorders>
               <w:top w:val="none" w:color="FFFFFF" w:sz="0"/>
               <w:left w:val="none" w:color="FFFFFF" w:sz="0"/>
-              <w:bottom w:val="single" w:color="DCD3C3" w:sz="4"/>
+              <w:bottom w:val="single" w:color="DDD9E5" w:sz="4"/>
               <w:right w:val="none" w:color="FFFFFF" w:sz="0"/>
             </w:tcBorders>
             <w:tcMar>
@@ -8042,7 +8042,7 @@
             <w:tcBorders>
               <w:top w:val="none" w:color="FFFFFF" w:sz="0"/>
               <w:left w:val="none" w:color="FFFFFF" w:sz="0"/>
-              <w:bottom w:val="single" w:color="DCD3C3" w:sz="4"/>
+              <w:bottom w:val="single" w:color="DDD9E5" w:sz="4"/>
               <w:right w:val="none" w:color="FFFFFF" w:sz="0"/>
             </w:tcBorders>
             <w:tcMar>
@@ -8068,7 +8068,7 @@
             <w:tcBorders>
               <w:top w:val="none" w:color="FFFFFF" w:sz="0"/>
               <w:left w:val="none" w:color="FFFFFF" w:sz="0"/>
-              <w:bottom w:val="single" w:color="DCD3C3" w:sz="4"/>
+              <w:bottom w:val="single" w:color="DDD9E5" w:sz="4"/>
               <w:right w:val="none" w:color="FFFFFF" w:sz="0"/>
             </w:tcBorders>
             <w:tcMar>
@@ -8376,7 +8376,7 @@
               <w:bottom w:val="none" w:color="FFFFFF" w:sz="0"/>
               <w:right w:val="none" w:color="FFFFFF" w:sz="0"/>
             </w:tcBorders>
-            <w:shd w:fill="FAEDDC" w:color="auto" w:val="clear"/>
+            <w:shd w:fill="EFE7FF" w:color="auto" w:val="clear"/>
             <w:tcMar>
               <w:top w:type="dxa" w:w="70"/>
               <w:left w:type="dxa" w:w="110"/>
@@ -8393,7 +8393,7 @@
                 <w:rFonts w:ascii="Arial" w:cs="Arial" w:eastAsia="Arial" w:hAnsi="Arial"/>
                 <w:b/>
                 <w:bCs/>
-                <w:color w:val="D98324"/>
+                <w:color w:val="6D3FD1"/>
                 <w:spacing w:val="20"/>
                 <w:sz w:val="15"/>
                 <w:szCs w:val="15"/>
@@ -8491,7 +8491,7 @@
           <w:rFonts w:ascii="Arial" w:cs="Arial" w:eastAsia="Arial" w:hAnsi="Arial"/>
           <w:b/>
           <w:bCs/>
-          <w:color w:val="7C766B"/>
+          <w:color w:val="6C6873"/>
           <w:spacing w:val="20"/>
           <w:sz w:val="15"/>
           <w:szCs w:val="15"/>
@@ -8594,10 +8594,10 @@
             <w:tcBorders>
               <w:top w:val="none" w:color="FFFFFF" w:sz="0"/>
               <w:left w:val="none" w:color="FFFFFF" w:sz="0"/>
-              <w:bottom w:val="single" w:color="DCD3C3" w:sz="4"/>
-              <w:right w:val="none" w:color="FFFFFF" w:sz="0"/>
-            </w:tcBorders>
-            <w:shd w:fill="F1ECE3" w:color="auto" w:val="clear"/>
+              <w:bottom w:val="single" w:color="DDD9E5" w:sz="4"/>
+              <w:right w:val="none" w:color="FFFFFF" w:sz="0"/>
+            </w:tcBorders>
+            <w:shd w:fill="F6F4F9" w:color="auto" w:val="clear"/>
             <w:tcMar>
               <w:top w:type="dxa" w:w="70"/>
               <w:left w:type="dxa" w:w="110"/>
@@ -8623,10 +8623,10 @@
             <w:tcBorders>
               <w:top w:val="none" w:color="FFFFFF" w:sz="0"/>
               <w:left w:val="none" w:color="FFFFFF" w:sz="0"/>
-              <w:bottom w:val="single" w:color="DCD3C3" w:sz="4"/>
-              <w:right w:val="none" w:color="FFFFFF" w:sz="0"/>
-            </w:tcBorders>
-            <w:shd w:fill="F1ECE3" w:color="auto" w:val="clear"/>
+              <w:bottom w:val="single" w:color="DDD9E5" w:sz="4"/>
+              <w:right w:val="none" w:color="FFFFFF" w:sz="0"/>
+            </w:tcBorders>
+            <w:shd w:fill="F6F4F9" w:color="auto" w:val="clear"/>
             <w:tcMar>
               <w:top w:type="dxa" w:w="70"/>
               <w:left w:type="dxa" w:w="110"/>
@@ -8652,10 +8652,10 @@
             <w:tcBorders>
               <w:top w:val="none" w:color="FFFFFF" w:sz="0"/>
               <w:left w:val="none" w:color="FFFFFF" w:sz="0"/>
-              <w:bottom w:val="single" w:color="DCD3C3" w:sz="4"/>
-              <w:right w:val="none" w:color="FFFFFF" w:sz="0"/>
-            </w:tcBorders>
-            <w:shd w:fill="F1ECE3" w:color="auto" w:val="clear"/>
+              <w:bottom w:val="single" w:color="DDD9E5" w:sz="4"/>
+              <w:right w:val="none" w:color="FFFFFF" w:sz="0"/>
+            </w:tcBorders>
+            <w:shd w:fill="F6F4F9" w:color="auto" w:val="clear"/>
             <w:tcMar>
               <w:top w:type="dxa" w:w="70"/>
               <w:left w:type="dxa" w:w="110"/>
@@ -8681,10 +8681,10 @@
             <w:tcBorders>
               <w:top w:val="none" w:color="FFFFFF" w:sz="0"/>
               <w:left w:val="none" w:color="FFFFFF" w:sz="0"/>
-              <w:bottom w:val="single" w:color="DCD3C3" w:sz="4"/>
-              <w:right w:val="none" w:color="FFFFFF" w:sz="0"/>
-            </w:tcBorders>
-            <w:shd w:fill="F1ECE3" w:color="auto" w:val="clear"/>
+              <w:bottom w:val="single" w:color="DDD9E5" w:sz="4"/>
+              <w:right w:val="none" w:color="FFFFFF" w:sz="0"/>
+            </w:tcBorders>
+            <w:shd w:fill="F6F4F9" w:color="auto" w:val="clear"/>
             <w:tcMar>
               <w:top w:type="dxa" w:w="70"/>
               <w:left w:type="dxa" w:w="110"/>
@@ -8712,7 +8712,7 @@
             <w:tcBorders>
               <w:top w:val="none" w:color="FFFFFF" w:sz="0"/>
               <w:left w:val="none" w:color="FFFFFF" w:sz="0"/>
-              <w:bottom w:val="single" w:color="DCD3C3" w:sz="4"/>
+              <w:bottom w:val="single" w:color="DDD9E5" w:sz="4"/>
               <w:right w:val="none" w:color="FFFFFF" w:sz="0"/>
             </w:tcBorders>
             <w:tcMar>
@@ -8738,7 +8738,7 @@
             <w:tcBorders>
               <w:top w:val="none" w:color="FFFFFF" w:sz="0"/>
               <w:left w:val="none" w:color="FFFFFF" w:sz="0"/>
-              <w:bottom w:val="single" w:color="DCD3C3" w:sz="4"/>
+              <w:bottom w:val="single" w:color="DDD9E5" w:sz="4"/>
               <w:right w:val="none" w:color="FFFFFF" w:sz="0"/>
             </w:tcBorders>
             <w:tcMar>
@@ -8764,7 +8764,7 @@
             <w:tcBorders>
               <w:top w:val="none" w:color="FFFFFF" w:sz="0"/>
               <w:left w:val="none" w:color="FFFFFF" w:sz="0"/>
-              <w:bottom w:val="single" w:color="DCD3C3" w:sz="4"/>
+              <w:bottom w:val="single" w:color="DDD9E5" w:sz="4"/>
               <w:right w:val="none" w:color="FFFFFF" w:sz="0"/>
             </w:tcBorders>
             <w:tcMar>
@@ -8820,7 +8820,7 @@
             <w:tcBorders>
               <w:top w:val="none" w:color="FFFFFF" w:sz="0"/>
               <w:left w:val="none" w:color="FFFFFF" w:sz="0"/>
-              <w:bottom w:val="single" w:color="DCD3C3" w:sz="4"/>
+              <w:bottom w:val="single" w:color="DDD9E5" w:sz="4"/>
               <w:right w:val="none" w:color="FFFFFF" w:sz="0"/>
             </w:tcBorders>
             <w:tcMar>
@@ -8872,7 +8872,7 @@
             <w:tcBorders>
               <w:top w:val="none" w:color="FFFFFF" w:sz="0"/>
               <w:left w:val="none" w:color="FFFFFF" w:sz="0"/>
-              <w:bottom w:val="single" w:color="DCD3C3" w:sz="4"/>
+              <w:bottom w:val="single" w:color="DDD9E5" w:sz="4"/>
               <w:right w:val="none" w:color="FFFFFF" w:sz="0"/>
             </w:tcBorders>
             <w:tcMar>
@@ -8898,7 +8898,7 @@
             <w:tcBorders>
               <w:top w:val="none" w:color="FFFFFF" w:sz="0"/>
               <w:left w:val="none" w:color="FFFFFF" w:sz="0"/>
-              <w:bottom w:val="single" w:color="DCD3C3" w:sz="4"/>
+              <w:bottom w:val="single" w:color="DDD9E5" w:sz="4"/>
               <w:right w:val="none" w:color="FFFFFF" w:sz="0"/>
             </w:tcBorders>
             <w:tcMar>
@@ -8924,7 +8924,7 @@
             <w:tcBorders>
               <w:top w:val="none" w:color="FFFFFF" w:sz="0"/>
               <w:left w:val="none" w:color="FFFFFF" w:sz="0"/>
-              <w:bottom w:val="single" w:color="DCD3C3" w:sz="4"/>
+              <w:bottom w:val="single" w:color="DDD9E5" w:sz="4"/>
               <w:right w:val="none" w:color="FFFFFF" w:sz="0"/>
             </w:tcBorders>
             <w:tcMar>
@@ -8965,7 +8965,7 @@
             <w:tcBorders>
               <w:top w:val="none" w:color="FFFFFF" w:sz="0"/>
               <w:left w:val="none" w:color="FFFFFF" w:sz="0"/>
-              <w:bottom w:val="single" w:color="DCD3C3" w:sz="4"/>
+              <w:bottom w:val="single" w:color="DDD9E5" w:sz="4"/>
               <w:right w:val="none" w:color="FFFFFF" w:sz="0"/>
             </w:tcBorders>
             <w:tcMar>
@@ -8995,7 +8995,7 @@
             <w:tcBorders>
               <w:top w:val="none" w:color="FFFFFF" w:sz="0"/>
               <w:left w:val="none" w:color="FFFFFF" w:sz="0"/>
-              <w:bottom w:val="single" w:color="DCD3C3" w:sz="4"/>
+              <w:bottom w:val="single" w:color="DDD9E5" w:sz="4"/>
               <w:right w:val="none" w:color="FFFFFF" w:sz="0"/>
             </w:tcBorders>
             <w:tcMar>
@@ -9021,7 +9021,7 @@
             <w:tcBorders>
               <w:top w:val="none" w:color="FFFFFF" w:sz="0"/>
               <w:left w:val="none" w:color="FFFFFF" w:sz="0"/>
-              <w:bottom w:val="single" w:color="DCD3C3" w:sz="4"/>
+              <w:bottom w:val="single" w:color="DDD9E5" w:sz="4"/>
               <w:right w:val="none" w:color="FFFFFF" w:sz="0"/>
             </w:tcBorders>
             <w:tcMar>
@@ -9047,7 +9047,7 @@
             <w:tcBorders>
               <w:top w:val="none" w:color="FFFFFF" w:sz="0"/>
               <w:left w:val="none" w:color="FFFFFF" w:sz="0"/>
-              <w:bottom w:val="single" w:color="DCD3C3" w:sz="4"/>
+              <w:bottom w:val="single" w:color="DDD9E5" w:sz="4"/>
               <w:right w:val="none" w:color="FFFFFF" w:sz="0"/>
             </w:tcBorders>
             <w:tcMar>
@@ -9073,7 +9073,7 @@
             <w:tcBorders>
               <w:top w:val="none" w:color="FFFFFF" w:sz="0"/>
               <w:left w:val="none" w:color="FFFFFF" w:sz="0"/>
-              <w:bottom w:val="single" w:color="DCD3C3" w:sz="4"/>
+              <w:bottom w:val="single" w:color="DDD9E5" w:sz="4"/>
               <w:right w:val="none" w:color="FFFFFF" w:sz="0"/>
             </w:tcBorders>
             <w:tcMar>
@@ -9137,10 +9137,10 @@
             <w:tcBorders>
               <w:top w:val="none" w:color="FFFFFF" w:sz="0"/>
               <w:left w:val="none" w:color="FFFFFF" w:sz="0"/>
-              <w:bottom w:val="single" w:color="DCD3C3" w:sz="4"/>
-              <w:right w:val="none" w:color="FFFFFF" w:sz="0"/>
-            </w:tcBorders>
-            <w:shd w:fill="F1ECE3" w:color="auto" w:val="clear"/>
+              <w:bottom w:val="single" w:color="DDD9E5" w:sz="4"/>
+              <w:right w:val="none" w:color="FFFFFF" w:sz="0"/>
+            </w:tcBorders>
+            <w:shd w:fill="F6F4F9" w:color="auto" w:val="clear"/>
             <w:tcMar>
               <w:top w:type="dxa" w:w="70"/>
               <w:left w:type="dxa" w:w="110"/>
@@ -9166,10 +9166,10 @@
             <w:tcBorders>
               <w:top w:val="none" w:color="FFFFFF" w:sz="0"/>
               <w:left w:val="none" w:color="FFFFFF" w:sz="0"/>
-              <w:bottom w:val="single" w:color="DCD3C3" w:sz="4"/>
-              <w:right w:val="none" w:color="FFFFFF" w:sz="0"/>
-            </w:tcBorders>
-            <w:shd w:fill="F1ECE3" w:color="auto" w:val="clear"/>
+              <w:bottom w:val="single" w:color="DDD9E5" w:sz="4"/>
+              <w:right w:val="none" w:color="FFFFFF" w:sz="0"/>
+            </w:tcBorders>
+            <w:shd w:fill="F6F4F9" w:color="auto" w:val="clear"/>
             <w:tcMar>
               <w:top w:type="dxa" w:w="70"/>
               <w:left w:type="dxa" w:w="110"/>
@@ -9195,10 +9195,10 @@
             <w:tcBorders>
               <w:top w:val="none" w:color="FFFFFF" w:sz="0"/>
               <w:left w:val="none" w:color="FFFFFF" w:sz="0"/>
-              <w:bottom w:val="single" w:color="DCD3C3" w:sz="4"/>
-              <w:right w:val="none" w:color="FFFFFF" w:sz="0"/>
-            </w:tcBorders>
-            <w:shd w:fill="F1ECE3" w:color="auto" w:val="clear"/>
+              <w:bottom w:val="single" w:color="DDD9E5" w:sz="4"/>
+              <w:right w:val="none" w:color="FFFFFF" w:sz="0"/>
+            </w:tcBorders>
+            <w:shd w:fill="F6F4F9" w:color="auto" w:val="clear"/>
             <w:tcMar>
               <w:top w:type="dxa" w:w="70"/>
               <w:left w:type="dxa" w:w="110"/>
@@ -9224,10 +9224,10 @@
             <w:tcBorders>
               <w:top w:val="none" w:color="FFFFFF" w:sz="0"/>
               <w:left w:val="none" w:color="FFFFFF" w:sz="0"/>
-              <w:bottom w:val="single" w:color="DCD3C3" w:sz="4"/>
-              <w:right w:val="none" w:color="FFFFFF" w:sz="0"/>
-            </w:tcBorders>
-            <w:shd w:fill="F1ECE3" w:color="auto" w:val="clear"/>
+              <w:bottom w:val="single" w:color="DDD9E5" w:sz="4"/>
+              <w:right w:val="none" w:color="FFFFFF" w:sz="0"/>
+            </w:tcBorders>
+            <w:shd w:fill="F6F4F9" w:color="auto" w:val="clear"/>
             <w:tcMar>
               <w:top w:type="dxa" w:w="70"/>
               <w:left w:type="dxa" w:w="110"/>
@@ -9255,7 +9255,7 @@
             <w:tcBorders>
               <w:top w:val="none" w:color="FFFFFF" w:sz="0"/>
               <w:left w:val="none" w:color="FFFFFF" w:sz="0"/>
-              <w:bottom w:val="single" w:color="DCD3C3" w:sz="4"/>
+              <w:bottom w:val="single" w:color="DDD9E5" w:sz="4"/>
               <w:right w:val="none" w:color="FFFFFF" w:sz="0"/>
             </w:tcBorders>
             <w:tcMar>
@@ -9281,7 +9281,7 @@
             <w:tcBorders>
               <w:top w:val="none" w:color="FFFFFF" w:sz="0"/>
               <w:left w:val="none" w:color="FFFFFF" w:sz="0"/>
-              <w:bottom w:val="single" w:color="DCD3C3" w:sz="4"/>
+              <w:bottom w:val="single" w:color="DDD9E5" w:sz="4"/>
               <w:right w:val="none" w:color="FFFFFF" w:sz="0"/>
             </w:tcBorders>
             <w:tcMar>
@@ -9307,7 +9307,7 @@
             <w:tcBorders>
               <w:top w:val="none" w:color="FFFFFF" w:sz="0"/>
               <w:left w:val="none" w:color="FFFFFF" w:sz="0"/>
-              <w:bottom w:val="single" w:color="DCD3C3" w:sz="4"/>
+              <w:bottom w:val="single" w:color="DDD9E5" w:sz="4"/>
               <w:right w:val="none" w:color="FFFFFF" w:sz="0"/>
             </w:tcBorders>
             <w:tcMar>
@@ -9348,7 +9348,7 @@
             <w:tcBorders>
               <w:top w:val="none" w:color="FFFFFF" w:sz="0"/>
               <w:left w:val="none" w:color="FFFFFF" w:sz="0"/>
-              <w:bottom w:val="single" w:color="DCD3C3" w:sz="4"/>
+              <w:bottom w:val="single" w:color="DDD9E5" w:sz="4"/>
               <w:right w:val="none" w:color="FFFFFF" w:sz="0"/>
             </w:tcBorders>
             <w:tcMar>
@@ -9385,7 +9385,7 @@
             <w:tcBorders>
               <w:top w:val="none" w:color="FFFFFF" w:sz="0"/>
               <w:left w:val="none" w:color="FFFFFF" w:sz="0"/>
-              <w:bottom w:val="single" w:color="DCD3C3" w:sz="4"/>
+              <w:bottom w:val="single" w:color="DDD9E5" w:sz="4"/>
               <w:right w:val="none" w:color="FFFFFF" w:sz="0"/>
             </w:tcBorders>
             <w:tcMar>
@@ -9411,7 +9411,7 @@
             <w:tcBorders>
               <w:top w:val="none" w:color="FFFFFF" w:sz="0"/>
               <w:left w:val="none" w:color="FFFFFF" w:sz="0"/>
-              <w:bottom w:val="single" w:color="DCD3C3" w:sz="4"/>
+              <w:bottom w:val="single" w:color="DDD9E5" w:sz="4"/>
               <w:right w:val="none" w:color="FFFFFF" w:sz="0"/>
             </w:tcBorders>
             <w:tcMar>
@@ -9437,7 +9437,7 @@
             <w:tcBorders>
               <w:top w:val="none" w:color="FFFFFF" w:sz="0"/>
               <w:left w:val="none" w:color="FFFFFF" w:sz="0"/>
-              <w:bottom w:val="single" w:color="DCD3C3" w:sz="4"/>
+              <w:bottom w:val="single" w:color="DDD9E5" w:sz="4"/>
               <w:right w:val="none" w:color="FFFFFF" w:sz="0"/>
             </w:tcBorders>
             <w:tcMar>
@@ -9478,7 +9478,7 @@
             <w:tcBorders>
               <w:top w:val="none" w:color="FFFFFF" w:sz="0"/>
               <w:left w:val="none" w:color="FFFFFF" w:sz="0"/>
-              <w:bottom w:val="single" w:color="DCD3C3" w:sz="4"/>
+              <w:bottom w:val="single" w:color="DDD9E5" w:sz="4"/>
               <w:right w:val="none" w:color="FFFFFF" w:sz="0"/>
             </w:tcBorders>
             <w:tcMar>
@@ -9765,7 +9765,7 @@
               <w:bottom w:val="none" w:color="FFFFFF" w:sz="0"/>
               <w:right w:val="none" w:color="FFFFFF" w:sz="0"/>
             </w:tcBorders>
-            <w:shd w:fill="FAEDDC" w:color="auto" w:val="clear"/>
+            <w:shd w:fill="EFE7FF" w:color="auto" w:val="clear"/>
             <w:tcMar>
               <w:top w:type="dxa" w:w="70"/>
               <w:left w:type="dxa" w:w="110"/>
@@ -9782,7 +9782,7 @@
                 <w:rFonts w:ascii="Arial" w:cs="Arial" w:eastAsia="Arial" w:hAnsi="Arial"/>
                 <w:b/>
                 <w:bCs/>
-                <w:color w:val="D98324"/>
+                <w:color w:val="6D3FD1"/>
                 <w:spacing w:val="20"/>
                 <w:sz w:val="15"/>
                 <w:szCs w:val="15"/>
@@ -9923,7 +9923,7 @@
     </w:pPr>
     <w:r>
       <w:rPr>
-        <w:color w:val="7C766B"/>
+        <w:color w:val="6C6873"/>
         <w:sz w:val="15"/>
         <w:szCs w:val="15"/>
       </w:rPr>
@@ -9931,7 +9931,7 @@
     </w:r>
     <w:r>
       <w:rPr>
-        <w:color w:val="7C766B"/>
+        <w:color w:val="6C6873"/>
         <w:sz w:val="15"/>
         <w:szCs w:val="15"/>
       </w:rPr>
@@ -9990,7 +9990,7 @@
     <w:r>
       <w:rPr>
         <w:rFonts w:ascii="Arial" w:cs="Arial" w:eastAsia="Arial" w:hAnsi="Arial"/>
-        <w:color w:val="7C766B"/>
+        <w:color w:val="6C6873"/>
         <w:sz w:val="15"/>
         <w:szCs w:val="15"/>
       </w:rPr>
@@ -10119,7 +10119,7 @@
     <w:rPrDefault>
       <w:rPr>
         <w:rFonts w:ascii="Calibri" w:cs="Calibri" w:eastAsia="Calibri" w:hAnsi="Calibri"/>
-        <w:color w:val="0F1318"/>
+        <w:color w:val="2A0F57"/>
         <w:sz w:val="21"/>
         <w:szCs w:val="21"/>
       </w:rPr>
@@ -10268,7 +10268,7 @@
       <w:rFonts w:ascii="Arial" w:cs="Arial" w:eastAsia="Arial" w:hAnsi="Arial"/>
       <w:b/>
       <w:bCs/>
-      <w:color w:val="0F1318"/>
+      <w:color w:val="2A0F57"/>
       <w:sz w:val="44"/>
       <w:szCs w:val="44"/>
     </w:rPr>
@@ -10286,7 +10286,7 @@
       <w:rFonts w:ascii="Arial" w:cs="Arial" w:eastAsia="Arial" w:hAnsi="Arial"/>
       <w:b/>
       <w:bCs/>
-      <w:color w:val="0F1318"/>
+      <w:color w:val="2A0F57"/>
       <w:sz w:val="32"/>
       <w:szCs w:val="32"/>
     </w:rPr>
@@ -10304,7 +10304,7 @@
       <w:rFonts w:ascii="Arial" w:cs="Arial" w:eastAsia="Arial" w:hAnsi="Arial"/>
       <w:b/>
       <w:bCs/>
-      <w:color w:val="0F1318"/>
+      <w:color w:val="2A0F57"/>
       <w:sz w:val="25"/>
       <w:szCs w:val="25"/>
     </w:rPr>
@@ -10322,7 +10322,7 @@
       <w:rFonts w:ascii="Arial" w:cs="Arial" w:eastAsia="Arial" w:hAnsi="Arial"/>
       <w:b/>
       <w:bCs/>
-      <w:color w:val="D98324"/>
+      <w:color w:val="6D3FD1"/>
       <w:sz w:val="21"/>
       <w:szCs w:val="21"/>
     </w:rPr>

</xml_diff>